<commit_message>
P0 protocol docx: fill Tables 12.1/12.2 with CIRCO results and add Section 16 (results, audit, grounding diagnostic)
Co-Authored-By: Claude Sonnet 5 <noreply@anthropic.com>
</commit_message>
<xml_diff>
--- a/P0_TRACE_CIR_Experimental_QKhai.docx
+++ b/P0_TRACE_CIR_Experimental_QKhai.docx
@@ -2112,35 +2112,80 @@
             <w:tcW w:w="1440" w:type="dxa"/>
             <w:vAlign w:val="center"/>
           </w:tcPr>
-          <w:p/>
+          <w:p>
+            <w:r/>
+            <w:r>
+              <w:rPr>
+                <w:b w:val="0"/>
+                <w:sz w:val="17"/>
+              </w:rPr>
+              <w:t>26.49</w:t>
+            </w:r>
+          </w:p>
         </w:tc>
         <w:tc>
           <w:tcPr>
             <w:tcW w:w="1440" w:type="dxa"/>
             <w:vAlign w:val="center"/>
           </w:tcPr>
-          <w:p/>
+          <w:p>
+            <w:r/>
+            <w:r>
+              <w:rPr>
+                <w:b w:val="0"/>
+                <w:sz w:val="17"/>
+              </w:rPr>
+              <w:t>28.12</w:t>
+            </w:r>
+          </w:p>
         </w:tc>
         <w:tc>
           <w:tcPr>
             <w:tcW w:w="1152" w:type="dxa"/>
             <w:vAlign w:val="center"/>
           </w:tcPr>
-          <w:p/>
+          <w:p>
+            <w:r/>
+            <w:r>
+              <w:rPr>
+                <w:b w:val="0"/>
+                <w:sz w:val="17"/>
+              </w:rPr>
+              <w:t>not run</w:t>
+            </w:r>
+          </w:p>
         </w:tc>
         <w:tc>
           <w:tcPr>
             <w:tcW w:w="1152" w:type="dxa"/>
             <w:vAlign w:val="center"/>
           </w:tcPr>
-          <w:p/>
+          <w:p>
+            <w:r/>
+            <w:r>
+              <w:rPr>
+                <w:b w:val="0"/>
+                <w:sz w:val="17"/>
+              </w:rPr>
+              <w:t>not run</w:t>
+            </w:r>
+          </w:p>
         </w:tc>
         <w:tc>
           <w:tcPr>
             <w:tcW w:w="1152" w:type="dxa"/>
             <w:vAlign w:val="center"/>
           </w:tcPr>
-          <w:p/>
+          <w:p>
+            <w:r/>
+            <w:r>
+              <w:rPr>
+                <w:b w:val="0"/>
+                <w:sz w:val="17"/>
+              </w:rPr>
+              <w:t>not run</w:t>
+            </w:r>
+          </w:p>
         </w:tc>
       </w:tr>
       <w:tr>
@@ -2166,35 +2211,80 @@
             <w:tcW w:w="1440" w:type="dxa"/>
             <w:vAlign w:val="center"/>
           </w:tcPr>
-          <w:p/>
+          <w:p>
+            <w:r/>
+            <w:r>
+              <w:rPr>
+                <w:b w:val="0"/>
+                <w:sz w:val="17"/>
+              </w:rPr>
+              <w:t>24.51</w:t>
+            </w:r>
+          </w:p>
         </w:tc>
         <w:tc>
           <w:tcPr>
             <w:tcW w:w="1440" w:type="dxa"/>
             <w:vAlign w:val="center"/>
           </w:tcPr>
-          <w:p/>
+          <w:p>
+            <w:r/>
+            <w:r>
+              <w:rPr>
+                <w:b w:val="0"/>
+                <w:sz w:val="17"/>
+              </w:rPr>
+              <w:t>25.61</w:t>
+            </w:r>
+          </w:p>
         </w:tc>
         <w:tc>
           <w:tcPr>
             <w:tcW w:w="1152" w:type="dxa"/>
             <w:vAlign w:val="center"/>
           </w:tcPr>
-          <w:p/>
+          <w:p>
+            <w:r/>
+            <w:r>
+              <w:rPr>
+                <w:b w:val="0"/>
+                <w:sz w:val="17"/>
+              </w:rPr>
+              <w:t>not run</w:t>
+            </w:r>
+          </w:p>
         </w:tc>
         <w:tc>
           <w:tcPr>
             <w:tcW w:w="1152" w:type="dxa"/>
             <w:vAlign w:val="center"/>
           </w:tcPr>
-          <w:p/>
+          <w:p>
+            <w:r/>
+            <w:r>
+              <w:rPr>
+                <w:b w:val="0"/>
+                <w:sz w:val="17"/>
+              </w:rPr>
+              <w:t>not run</w:t>
+            </w:r>
+          </w:p>
         </w:tc>
         <w:tc>
           <w:tcPr>
             <w:tcW w:w="1152" w:type="dxa"/>
             <w:vAlign w:val="center"/>
           </w:tcPr>
-          <w:p/>
+          <w:p>
+            <w:r/>
+            <w:r>
+              <w:rPr>
+                <w:b w:val="0"/>
+                <w:sz w:val="17"/>
+              </w:rPr>
+              <w:t>not run</w:t>
+            </w:r>
+          </w:p>
         </w:tc>
       </w:tr>
       <w:tr>
@@ -2220,35 +2310,80 @@
             <w:tcW w:w="1440" w:type="dxa"/>
             <w:vAlign w:val="center"/>
           </w:tcPr>
-          <w:p/>
+          <w:p>
+            <w:r/>
+            <w:r>
+              <w:rPr>
+                <w:b w:val="0"/>
+                <w:sz w:val="17"/>
+              </w:rPr>
+              <w:t>25.18</w:t>
+            </w:r>
+          </w:p>
         </w:tc>
         <w:tc>
           <w:tcPr>
             <w:tcW w:w="1440" w:type="dxa"/>
             <w:vAlign w:val="center"/>
           </w:tcPr>
-          <w:p/>
+          <w:p>
+            <w:r/>
+            <w:r>
+              <w:rPr>
+                <w:b w:val="0"/>
+                <w:sz w:val="17"/>
+              </w:rPr>
+              <w:t>26.33</w:t>
+            </w:r>
+          </w:p>
         </w:tc>
         <w:tc>
           <w:tcPr>
             <w:tcW w:w="1152" w:type="dxa"/>
             <w:vAlign w:val="center"/>
           </w:tcPr>
-          <w:p/>
+          <w:p>
+            <w:r/>
+            <w:r>
+              <w:rPr>
+                <w:b w:val="0"/>
+                <w:sz w:val="17"/>
+              </w:rPr>
+              <w:t>not run</w:t>
+            </w:r>
+          </w:p>
         </w:tc>
         <w:tc>
           <w:tcPr>
             <w:tcW w:w="1152" w:type="dxa"/>
             <w:vAlign w:val="center"/>
           </w:tcPr>
-          <w:p/>
+          <w:p>
+            <w:r/>
+            <w:r>
+              <w:rPr>
+                <w:b w:val="0"/>
+                <w:sz w:val="17"/>
+              </w:rPr>
+              <w:t>not run</w:t>
+            </w:r>
+          </w:p>
         </w:tc>
         <w:tc>
           <w:tcPr>
             <w:tcW w:w="1152" w:type="dxa"/>
             <w:vAlign w:val="center"/>
           </w:tcPr>
-          <w:p/>
+          <w:p>
+            <w:r/>
+            <w:r>
+              <w:rPr>
+                <w:b w:val="0"/>
+                <w:sz w:val="17"/>
+              </w:rPr>
+              <w:t>not run</w:t>
+            </w:r>
+          </w:p>
         </w:tc>
       </w:tr>
       <w:tr>
@@ -2274,35 +2409,80 @@
             <w:tcW w:w="1440" w:type="dxa"/>
             <w:vAlign w:val="center"/>
           </w:tcPr>
-          <w:p/>
+          <w:p>
+            <w:r/>
+            <w:r>
+              <w:rPr>
+                <w:b w:val="0"/>
+                <w:sz w:val="17"/>
+              </w:rPr>
+              <w:t>23.34</w:t>
+            </w:r>
+          </w:p>
         </w:tc>
         <w:tc>
           <w:tcPr>
             <w:tcW w:w="1440" w:type="dxa"/>
             <w:vAlign w:val="center"/>
           </w:tcPr>
-          <w:p/>
+          <w:p>
+            <w:r/>
+            <w:r>
+              <w:rPr>
+                <w:b w:val="0"/>
+                <w:sz w:val="17"/>
+              </w:rPr>
+              <w:t>25.05</w:t>
+            </w:r>
+          </w:p>
         </w:tc>
         <w:tc>
           <w:tcPr>
             <w:tcW w:w="1152" w:type="dxa"/>
             <w:vAlign w:val="center"/>
           </w:tcPr>
-          <w:p/>
+          <w:p>
+            <w:r/>
+            <w:r>
+              <w:rPr>
+                <w:b w:val="0"/>
+                <w:sz w:val="17"/>
+              </w:rPr>
+              <w:t>not run</w:t>
+            </w:r>
+          </w:p>
         </w:tc>
         <w:tc>
           <w:tcPr>
             <w:tcW w:w="1152" w:type="dxa"/>
             <w:vAlign w:val="center"/>
           </w:tcPr>
-          <w:p/>
+          <w:p>
+            <w:r/>
+            <w:r>
+              <w:rPr>
+                <w:b w:val="0"/>
+                <w:sz w:val="17"/>
+              </w:rPr>
+              <w:t>not run</w:t>
+            </w:r>
+          </w:p>
         </w:tc>
         <w:tc>
           <w:tcPr>
             <w:tcW w:w="1152" w:type="dxa"/>
             <w:vAlign w:val="center"/>
           </w:tcPr>
-          <w:p/>
+          <w:p>
+            <w:r/>
+            <w:r>
+              <w:rPr>
+                <w:b w:val="0"/>
+                <w:sz w:val="17"/>
+              </w:rPr>
+              <w:t>not run</w:t>
+            </w:r>
+          </w:p>
         </w:tc>
       </w:tr>
       <w:tr>
@@ -2328,35 +2508,80 @@
             <w:tcW w:w="1440" w:type="dxa"/>
             <w:vAlign w:val="center"/>
           </w:tcPr>
-          <w:p/>
+          <w:p>
+            <w:r/>
+            <w:r>
+              <w:rPr>
+                <w:b w:val="0"/>
+                <w:sz w:val="17"/>
+              </w:rPr>
+              <w:t>25.36</w:t>
+            </w:r>
+          </w:p>
         </w:tc>
         <w:tc>
           <w:tcPr>
             <w:tcW w:w="1440" w:type="dxa"/>
             <w:vAlign w:val="center"/>
           </w:tcPr>
-          <w:p/>
+          <w:p>
+            <w:r/>
+            <w:r>
+              <w:rPr>
+                <w:b w:val="0"/>
+                <w:sz w:val="17"/>
+              </w:rPr>
+              <w:t>26.70</w:t>
+            </w:r>
+          </w:p>
         </w:tc>
         <w:tc>
           <w:tcPr>
             <w:tcW w:w="1152" w:type="dxa"/>
             <w:vAlign w:val="center"/>
           </w:tcPr>
-          <w:p/>
+          <w:p>
+            <w:r/>
+            <w:r>
+              <w:rPr>
+                <w:b w:val="0"/>
+                <w:sz w:val="17"/>
+              </w:rPr>
+              <w:t>not run</w:t>
+            </w:r>
+          </w:p>
         </w:tc>
         <w:tc>
           <w:tcPr>
             <w:tcW w:w="1152" w:type="dxa"/>
             <w:vAlign w:val="center"/>
           </w:tcPr>
-          <w:p/>
+          <w:p>
+            <w:r/>
+            <w:r>
+              <w:rPr>
+                <w:b w:val="0"/>
+                <w:sz w:val="17"/>
+              </w:rPr>
+              <w:t>not run</w:t>
+            </w:r>
+          </w:p>
         </w:tc>
         <w:tc>
           <w:tcPr>
             <w:tcW w:w="1152" w:type="dxa"/>
             <w:vAlign w:val="center"/>
           </w:tcPr>
-          <w:p/>
+          <w:p>
+            <w:r/>
+            <w:r>
+              <w:rPr>
+                <w:b w:val="0"/>
+                <w:sz w:val="17"/>
+              </w:rPr>
+              <w:t>not run</w:t>
+            </w:r>
+          </w:p>
         </w:tc>
       </w:tr>
     </w:tbl>
@@ -2512,35 +2737,80 @@
             <w:tcW w:w="1296" w:type="dxa"/>
             <w:vAlign w:val="center"/>
           </w:tcPr>
-          <w:p/>
+          <w:p>
+            <w:r/>
+            <w:r>
+              <w:rPr>
+                <w:b w:val="0"/>
+                <w:sz w:val="17"/>
+              </w:rPr>
+              <w:t>23.83</w:t>
+            </w:r>
+          </w:p>
         </w:tc>
         <w:tc>
           <w:tcPr>
             <w:tcW w:w="1296" w:type="dxa"/>
             <w:vAlign w:val="center"/>
           </w:tcPr>
-          <w:p/>
+          <w:p>
+            <w:r/>
+            <w:r>
+              <w:rPr>
+                <w:b w:val="0"/>
+                <w:sz w:val="17"/>
+              </w:rPr>
+              <w:t>18.74</w:t>
+            </w:r>
+          </w:p>
         </w:tc>
         <w:tc>
           <w:tcPr>
             <w:tcW w:w="1440" w:type="dxa"/>
             <w:vAlign w:val="center"/>
           </w:tcPr>
-          <w:p/>
+          <w:p>
+            <w:r/>
+            <w:r>
+              <w:rPr>
+                <w:b w:val="0"/>
+                <w:sz w:val="17"/>
+              </w:rPr>
+              <w:t>29.06</w:t>
+            </w:r>
+          </w:p>
         </w:tc>
         <w:tc>
           <w:tcPr>
             <w:tcW w:w="1440" w:type="dxa"/>
             <w:vAlign w:val="center"/>
           </w:tcPr>
-          <w:p/>
+          <w:p>
+            <w:r/>
+            <w:r>
+              <w:rPr>
+                <w:b w:val="0"/>
+                <w:sz w:val="17"/>
+              </w:rPr>
+              <w:t>26.69</w:t>
+            </w:r>
+          </w:p>
         </w:tc>
         <w:tc>
           <w:tcPr>
             <w:tcW w:w="1440" w:type="dxa"/>
             <w:vAlign w:val="center"/>
           </w:tcPr>
-          <w:p/>
+          <w:p>
+            <w:r/>
+            <w:r>
+              <w:rPr>
+                <w:b w:val="0"/>
+                <w:sz w:val="17"/>
+              </w:rPr>
+              <w:t>25.47</w:t>
+            </w:r>
+          </w:p>
         </w:tc>
       </w:tr>
       <w:tr>
@@ -2566,35 +2836,80 @@
             <w:tcW w:w="1296" w:type="dxa"/>
             <w:vAlign w:val="center"/>
           </w:tcPr>
-          <w:p/>
+          <w:p>
+            <w:r/>
+            <w:r>
+              <w:rPr>
+                <w:b w:val="0"/>
+                <w:sz w:val="17"/>
+              </w:rPr>
+              <w:t>22.81</w:t>
+            </w:r>
+          </w:p>
         </w:tc>
         <w:tc>
           <w:tcPr>
             <w:tcW w:w="1296" w:type="dxa"/>
             <w:vAlign w:val="center"/>
           </w:tcPr>
-          <w:p/>
+          <w:p>
+            <w:r/>
+            <w:r>
+              <w:rPr>
+                <w:b w:val="0"/>
+                <w:sz w:val="17"/>
+              </w:rPr>
+              <w:t>17.21</w:t>
+            </w:r>
+          </w:p>
         </w:tc>
         <w:tc>
           <w:tcPr>
             <w:tcW w:w="1440" w:type="dxa"/>
             <w:vAlign w:val="center"/>
           </w:tcPr>
-          <w:p/>
+          <w:p>
+            <w:r/>
+            <w:r>
+              <w:rPr>
+                <w:b w:val="0"/>
+                <w:sz w:val="17"/>
+              </w:rPr>
+              <w:t>23.85</w:t>
+            </w:r>
+          </w:p>
         </w:tc>
         <w:tc>
           <w:tcPr>
             <w:tcW w:w="1440" w:type="dxa"/>
             <w:vAlign w:val="center"/>
           </w:tcPr>
-          <w:p/>
+          <w:p>
+            <w:r/>
+            <w:r>
+              <w:rPr>
+                <w:b w:val="0"/>
+                <w:sz w:val="17"/>
+              </w:rPr>
+              <w:t>25.11</w:t>
+            </w:r>
+          </w:p>
         </w:tc>
         <w:tc>
           <w:tcPr>
             <w:tcW w:w="1440" w:type="dxa"/>
             <w:vAlign w:val="center"/>
           </w:tcPr>
-          <w:p/>
+          <w:p>
+            <w:r/>
+            <w:r>
+              <w:rPr>
+                <w:b w:val="0"/>
+                <w:sz w:val="17"/>
+              </w:rPr>
+              <w:t>25.01</w:t>
+            </w:r>
+          </w:p>
         </w:tc>
       </w:tr>
       <w:tr>
@@ -2620,35 +2935,80 @@
             <w:tcW w:w="1296" w:type="dxa"/>
             <w:vAlign w:val="center"/>
           </w:tcPr>
-          <w:p/>
+          <w:p>
+            <w:r/>
+            <w:r>
+              <w:rPr>
+                <w:b w:val="0"/>
+                <w:sz w:val="17"/>
+              </w:rPr>
+              <w:t>23.11</w:t>
+            </w:r>
+          </w:p>
         </w:tc>
         <w:tc>
           <w:tcPr>
             <w:tcW w:w="1296" w:type="dxa"/>
             <w:vAlign w:val="center"/>
           </w:tcPr>
-          <w:p/>
+          <w:p>
+            <w:r/>
+            <w:r>
+              <w:rPr>
+                <w:b w:val="0"/>
+                <w:sz w:val="17"/>
+              </w:rPr>
+              <w:t>16.49</w:t>
+            </w:r>
+          </w:p>
         </w:tc>
         <w:tc>
           <w:tcPr>
             <w:tcW w:w="1440" w:type="dxa"/>
             <w:vAlign w:val="center"/>
           </w:tcPr>
-          <w:p/>
+          <w:p>
+            <w:r/>
+            <w:r>
+              <w:rPr>
+                <w:b w:val="0"/>
+                <w:sz w:val="17"/>
+              </w:rPr>
+              <w:t>25.43</w:t>
+            </w:r>
+          </w:p>
         </w:tc>
         <w:tc>
           <w:tcPr>
             <w:tcW w:w="1440" w:type="dxa"/>
             <w:vAlign w:val="center"/>
           </w:tcPr>
-          <w:p/>
+          <w:p>
+            <w:r/>
+            <w:r>
+              <w:rPr>
+                <w:b w:val="0"/>
+                <w:sz w:val="17"/>
+              </w:rPr>
+              <w:t>25.94</w:t>
+            </w:r>
+          </w:p>
         </w:tc>
         <w:tc>
           <w:tcPr>
             <w:tcW w:w="1440" w:type="dxa"/>
             <w:vAlign w:val="center"/>
           </w:tcPr>
-          <w:p/>
+          <w:p>
+            <w:r/>
+            <w:r>
+              <w:rPr>
+                <w:b w:val="0"/>
+                <w:sz w:val="17"/>
+              </w:rPr>
+              <w:t>25.30</w:t>
+            </w:r>
+          </w:p>
         </w:tc>
       </w:tr>
       <w:tr>
@@ -2675,35 +3035,80 @@
             <w:tcW w:w="1296" w:type="dxa"/>
             <w:vAlign w:val="center"/>
           </w:tcPr>
-          <w:p/>
+          <w:p>
+            <w:r/>
+            <w:r>
+              <w:rPr>
+                <w:b w:val="0"/>
+                <w:sz w:val="17"/>
+              </w:rPr>
+              <w:t>22.94</w:t>
+            </w:r>
+          </w:p>
         </w:tc>
         <w:tc>
           <w:tcPr>
             <w:tcW w:w="1296" w:type="dxa"/>
             <w:vAlign w:val="center"/>
           </w:tcPr>
-          <w:p/>
+          <w:p>
+            <w:r/>
+            <w:r>
+              <w:rPr>
+                <w:b w:val="0"/>
+                <w:sz w:val="17"/>
+              </w:rPr>
+              <w:t>15.30</w:t>
+            </w:r>
+          </w:p>
         </w:tc>
         <w:tc>
           <w:tcPr>
             <w:tcW w:w="1440" w:type="dxa"/>
             <w:vAlign w:val="center"/>
           </w:tcPr>
-          <w:p/>
+          <w:p>
+            <w:r/>
+            <w:r>
+              <w:rPr>
+                <w:b w:val="0"/>
+                <w:sz w:val="17"/>
+              </w:rPr>
+              <w:t>25.31</w:t>
+            </w:r>
+          </w:p>
         </w:tc>
         <w:tc>
           <w:tcPr>
             <w:tcW w:w="1440" w:type="dxa"/>
             <w:vAlign w:val="center"/>
           </w:tcPr>
-          <w:p/>
+          <w:p>
+            <w:r/>
+            <w:r>
+              <w:rPr>
+                <w:b w:val="0"/>
+                <w:sz w:val="17"/>
+              </w:rPr>
+              <w:t>23.71</w:t>
+            </w:r>
+          </w:p>
         </w:tc>
         <w:tc>
           <w:tcPr>
             <w:tcW w:w="1440" w:type="dxa"/>
             <w:vAlign w:val="center"/>
           </w:tcPr>
-          <w:p/>
+          <w:p>
+            <w:r/>
+            <w:r>
+              <w:rPr>
+                <w:b w:val="0"/>
+                <w:sz w:val="17"/>
+              </w:rPr>
+              <w:t>23.48</w:t>
+            </w:r>
+          </w:p>
         </w:tc>
       </w:tr>
       <w:tr>
@@ -2729,35 +3134,80 @@
             <w:tcW w:w="1296" w:type="dxa"/>
             <w:vAlign w:val="center"/>
           </w:tcPr>
-          <w:p/>
+          <w:p>
+            <w:r/>
+            <w:r>
+              <w:rPr>
+                <w:b w:val="0"/>
+                <w:sz w:val="17"/>
+              </w:rPr>
+              <w:t>23.67</w:t>
+            </w:r>
+          </w:p>
         </w:tc>
         <w:tc>
           <w:tcPr>
             <w:tcW w:w="1296" w:type="dxa"/>
             <w:vAlign w:val="center"/>
           </w:tcPr>
-          <w:p/>
+          <w:p>
+            <w:r/>
+            <w:r>
+              <w:rPr>
+                <w:b w:val="0"/>
+                <w:sz w:val="17"/>
+              </w:rPr>
+              <w:t>16.65</w:t>
+            </w:r>
+          </w:p>
         </w:tc>
         <w:tc>
           <w:tcPr>
             <w:tcW w:w="1440" w:type="dxa"/>
             <w:vAlign w:val="center"/>
           </w:tcPr>
-          <w:p/>
+          <w:p>
+            <w:r/>
+            <w:r>
+              <w:rPr>
+                <w:b w:val="0"/>
+                <w:sz w:val="17"/>
+              </w:rPr>
+              <w:t>24.82</w:t>
+            </w:r>
+          </w:p>
         </w:tc>
         <w:tc>
           <w:tcPr>
             <w:tcW w:w="1440" w:type="dxa"/>
             <w:vAlign w:val="center"/>
           </w:tcPr>
-          <w:p/>
+          <w:p>
+            <w:r/>
+            <w:r>
+              <w:rPr>
+                <w:b w:val="0"/>
+                <w:sz w:val="17"/>
+              </w:rPr>
+              <w:t>26.16</w:t>
+            </w:r>
+          </w:p>
         </w:tc>
         <w:tc>
           <w:tcPr>
             <w:tcW w:w="1440" w:type="dxa"/>
             <w:vAlign w:val="center"/>
           </w:tcPr>
-          <w:p/>
+          <w:p>
+            <w:r/>
+            <w:r>
+              <w:rPr>
+                <w:b w:val="0"/>
+                <w:sz w:val="17"/>
+              </w:rPr>
+              <w:t>26.01</w:t>
+            </w:r>
+          </w:p>
         </w:tc>
       </w:tr>
     </w:tbl>
@@ -3252,6 +3702,2123 @@
           <w:lang w:val="vi-VN"/>
         </w:rPr>
       </w:pPr>
+    </w:p>
+    <w:p>
+      <w:pPr>
+        <w:pStyle w:val="Heading1"/>
+      </w:pPr>
+      <w:r>
+        <w:t>16. Experimental Results (preliminary, CIRCO validation)</w:t>
+      </w:r>
+    </w:p>
+    <w:p>
+      <w:r>
+        <w:rPr>
+          <w:b w:val="0"/>
+          <w:i/>
+        </w:rPr>
+        <w:t>Status as of 2026-09-20. All numbers below are from CIRCO validation (220 queries, 123,403 gallery images). CIRR was not run. These are preliminary: the E0 factor weights are a placeholder, the compiler audit is an unofficial pre-audit, and the sample is small. Tables 12.1 and 12.2 above are filled with the CIRCO numbers; the CIRR columns are marked "not run". The original protocol text was not changed.</w:t>
+      </w:r>
+    </w:p>
+    <w:p>
+      <w:pPr>
+        <w:pStyle w:val="Heading2"/>
+      </w:pPr>
+      <w:r>
+        <w:t>16.1 What has and has not been done</w:t>
+      </w:r>
+    </w:p>
+    <w:p>
+      <w:pPr>
+        <w:pStyle w:val="ListBullet"/>
+      </w:pPr>
+      <w:r>
+        <w:rPr>
+          <w:b/>
+        </w:rPr>
+        <w:t>Done:</w:t>
+      </w:r>
+      <w:r>
+        <w:t xml:space="preserve"> feature caches for CIRCO (123,403 images) and CIRR validation (2,297 images); compiler run on all 220 CIRCO validation queries; E0-E4 on CIRCO validation; sensitivity grids for tau_g, beta and lambda_edit; per-query paired comparisons; 12 grounding heatmaps.</w:t>
+      </w:r>
+    </w:p>
+    <w:p>
+      <w:pPr>
+        <w:pStyle w:val="ListBullet"/>
+      </w:pPr>
+      <w:r>
+        <w:rPr>
+          <w:b/>
+        </w:rPr>
+        <w:t>Not done:</w:t>
+      </w:r>
+      <w:r>
+        <w:t xml:space="preserve"> compiler run and E0-E4 on CIRR; official manual audit (Sec. 5.3); REPLACE diagnostic logging (Sec. 13); the ~20 curated visualizations (Sec. 14); tau_m sensitivity (the protocol fixes it initially).</w:t>
+      </w:r>
+    </w:p>
+    <w:p>
+      <w:pPr>
+        <w:pStyle w:val="Heading2"/>
+      </w:pPr>
+      <w:r>
+        <w:t>16.2 Compiler and manual audit (Sec. 5.3)</w:t>
+      </w:r>
+    </w:p>
+    <w:p>
+      <w:r>
+        <w:rPr>
+          <w:b w:val="0"/>
+          <w:i w:val="0"/>
+        </w:rPr>
+        <w:t>Criterion applied: only "Correct" counts toward the ~85% threshold; "Partially correct" does not (instructor's ruling). 100 CIRCO validation queries were sampled at random (seed 0) and inspected against the reference image.</w:t>
+      </w:r>
+    </w:p>
+    <w:tbl>
+      <w:tblPr>
+        <w:tblStyle w:val="TableGrid"/>
+        <w:tblW w:type="auto" w:w="0"/>
+        <w:jc w:val="center"/>
+        <w:tblLayout w:type="fixed"/>
+        <w:tblLook w:firstColumn="1" w:firstRow="1" w:lastColumn="0" w:lastRow="0" w:noHBand="0" w:noVBand="1" w:val="04A0"/>
+      </w:tblPr>
+      <w:tblGrid>
+        <w:gridCol w:w="1680"/>
+        <w:gridCol w:w="1680"/>
+        <w:gridCol w:w="1680"/>
+        <w:gridCol w:w="1680"/>
+        <w:gridCol w:w="1680"/>
+        <w:gridCol w:w="1680"/>
+      </w:tblGrid>
+      <w:tr>
+        <w:tc>
+          <w:tcPr>
+            <w:tcW w:type="dxa" w:w="3515"/>
+            <w:shd w:val="clear" w:color="auto" w:fill="D9E2F3"/>
+          </w:tcPr>
+          <w:p>
+            <w:r/>
+            <w:r>
+              <w:rPr>
+                <w:b/>
+                <w:sz w:val="17"/>
+              </w:rPr>
+              <w:t>Compiler</w:t>
+            </w:r>
+          </w:p>
+        </w:tc>
+        <w:tc>
+          <w:tcPr>
+            <w:tcW w:type="dxa" w:w="1361"/>
+            <w:shd w:val="clear" w:color="auto" w:fill="D9E2F3"/>
+          </w:tcPr>
+          <w:p>
+            <w:r/>
+            <w:r>
+              <w:rPr>
+                <w:b/>
+                <w:sz w:val="17"/>
+              </w:rPr>
+              <w:t>Parse failures (of 220)</w:t>
+            </w:r>
+          </w:p>
+        </w:tc>
+        <w:tc>
+          <w:tcPr>
+            <w:tcW w:type="dxa" w:w="907"/>
+            <w:shd w:val="clear" w:color="auto" w:fill="D9E2F3"/>
+          </w:tcPr>
+          <w:p>
+            <w:r/>
+            <w:r>
+              <w:rPr>
+                <w:b/>
+                <w:sz w:val="17"/>
+              </w:rPr>
+              <w:t>Correct</w:t>
+            </w:r>
+          </w:p>
+        </w:tc>
+        <w:tc>
+          <w:tcPr>
+            <w:tcW w:type="dxa" w:w="964"/>
+            <w:shd w:val="clear" w:color="auto" w:fill="D9E2F3"/>
+          </w:tcPr>
+          <w:p>
+            <w:r/>
+            <w:r>
+              <w:rPr>
+                <w:b/>
+                <w:sz w:val="17"/>
+              </w:rPr>
+              <w:t>Partially</w:t>
+            </w:r>
+          </w:p>
+        </w:tc>
+        <w:tc>
+          <w:tcPr>
+            <w:tcW w:type="dxa" w:w="964"/>
+            <w:shd w:val="clear" w:color="auto" w:fill="D9E2F3"/>
+          </w:tcPr>
+          <w:p>
+            <w:r/>
+            <w:r>
+              <w:rPr>
+                <w:b/>
+                <w:sz w:val="17"/>
+              </w:rPr>
+              <w:t>Incorrect</w:t>
+            </w:r>
+          </w:p>
+        </w:tc>
+        <w:tc>
+          <w:tcPr>
+            <w:tcW w:type="dxa" w:w="2041"/>
+            <w:shd w:val="clear" w:color="auto" w:fill="D9E2F3"/>
+          </w:tcPr>
+          <w:p>
+            <w:r/>
+            <w:r>
+              <w:rPr>
+                <w:b/>
+                <w:sz w:val="17"/>
+              </w:rPr>
+              <w:t>Meets &gt;= 85%?</w:t>
+            </w:r>
+          </w:p>
+        </w:tc>
+      </w:tr>
+      <w:tr>
+        <w:tc>
+          <w:tcPr>
+            <w:tcW w:type="dxa" w:w="3515"/>
+          </w:tcPr>
+          <w:p>
+            <w:r/>
+            <w:r>
+              <w:rPr>
+                <w:b w:val="0"/>
+                <w:sz w:val="17"/>
+              </w:rPr>
+              <w:t>Qwen2.5-VL-7B, protocol Sec. 5.2 prompt verbatim</w:t>
+            </w:r>
+          </w:p>
+        </w:tc>
+        <w:tc>
+          <w:tcPr>
+            <w:tcW w:type="dxa" w:w="1361"/>
+          </w:tcPr>
+          <w:p>
+            <w:r/>
+            <w:r>
+              <w:rPr>
+                <w:b w:val="0"/>
+                <w:sz w:val="17"/>
+              </w:rPr>
+              <w:t>220</w:t>
+            </w:r>
+          </w:p>
+        </w:tc>
+        <w:tc>
+          <w:tcPr>
+            <w:tcW w:type="dxa" w:w="907"/>
+          </w:tcPr>
+          <w:p>
+            <w:r/>
+            <w:r>
+              <w:rPr>
+                <w:b w:val="0"/>
+                <w:sz w:val="17"/>
+              </w:rPr>
+              <w:t>-</w:t>
+            </w:r>
+          </w:p>
+        </w:tc>
+        <w:tc>
+          <w:tcPr>
+            <w:tcW w:type="dxa" w:w="964"/>
+          </w:tcPr>
+          <w:p>
+            <w:r/>
+            <w:r>
+              <w:rPr>
+                <w:b w:val="0"/>
+                <w:sz w:val="17"/>
+              </w:rPr>
+              <w:t>-</w:t>
+            </w:r>
+          </w:p>
+        </w:tc>
+        <w:tc>
+          <w:tcPr>
+            <w:tcW w:type="dxa" w:w="964"/>
+          </w:tcPr>
+          <w:p>
+            <w:r/>
+            <w:r>
+              <w:rPr>
+                <w:b w:val="0"/>
+                <w:sz w:val="17"/>
+              </w:rPr>
+              <w:t>-</w:t>
+            </w:r>
+          </w:p>
+        </w:tc>
+        <w:tc>
+          <w:tcPr>
+            <w:tcW w:type="dxa" w:w="2041"/>
+          </w:tcPr>
+          <w:p>
+            <w:r/>
+            <w:r>
+              <w:rPr>
+                <w:b w:val="0"/>
+                <w:sz w:val="17"/>
+              </w:rPr>
+              <w:t>No (unusable output)</w:t>
+            </w:r>
+          </w:p>
+        </w:tc>
+      </w:tr>
+      <w:tr>
+        <w:tc>
+          <w:tcPr>
+            <w:tcW w:type="dxa" w:w="3515"/>
+          </w:tcPr>
+          <w:p>
+            <w:r/>
+            <w:r>
+              <w:rPr>
+                <w:b w:val="0"/>
+                <w:sz w:val="17"/>
+              </w:rPr>
+              <w:t>Qwen2.5-VL-7B, prompt v2 (rules 1-14)</w:t>
+            </w:r>
+          </w:p>
+        </w:tc>
+        <w:tc>
+          <w:tcPr>
+            <w:tcW w:type="dxa" w:w="1361"/>
+          </w:tcPr>
+          <w:p>
+            <w:r/>
+            <w:r>
+              <w:rPr>
+                <w:b w:val="0"/>
+                <w:sz w:val="17"/>
+              </w:rPr>
+              <w:t>3</w:t>
+            </w:r>
+          </w:p>
+        </w:tc>
+        <w:tc>
+          <w:tcPr>
+            <w:tcW w:type="dxa" w:w="907"/>
+          </w:tcPr>
+          <w:p>
+            <w:r/>
+            <w:r>
+              <w:rPr>
+                <w:b w:val="0"/>
+                <w:sz w:val="17"/>
+              </w:rPr>
+              <w:t>60</w:t>
+            </w:r>
+          </w:p>
+        </w:tc>
+        <w:tc>
+          <w:tcPr>
+            <w:tcW w:type="dxa" w:w="964"/>
+          </w:tcPr>
+          <w:p>
+            <w:r/>
+            <w:r>
+              <w:rPr>
+                <w:b w:val="0"/>
+                <w:sz w:val="17"/>
+              </w:rPr>
+              <w:t>31</w:t>
+            </w:r>
+          </w:p>
+        </w:tc>
+        <w:tc>
+          <w:tcPr>
+            <w:tcW w:type="dxa" w:w="964"/>
+          </w:tcPr>
+          <w:p>
+            <w:r/>
+            <w:r>
+              <w:rPr>
+                <w:b w:val="0"/>
+                <w:sz w:val="17"/>
+              </w:rPr>
+              <w:t>9</w:t>
+            </w:r>
+          </w:p>
+        </w:tc>
+        <w:tc>
+          <w:tcPr>
+            <w:tcW w:type="dxa" w:w="2041"/>
+          </w:tcPr>
+          <w:p>
+            <w:r/>
+            <w:r>
+              <w:rPr>
+                <w:b w:val="0"/>
+                <w:sz w:val="17"/>
+              </w:rPr>
+              <w:t>No</w:t>
+            </w:r>
+          </w:p>
+        </w:tc>
+      </w:tr>
+      <w:tr>
+        <w:tc>
+          <w:tcPr>
+            <w:tcW w:type="dxa" w:w="3515"/>
+          </w:tcPr>
+          <w:p>
+            <w:r/>
+            <w:r>
+              <w:rPr>
+                <w:b/>
+                <w:sz w:val="17"/>
+              </w:rPr>
+              <w:t>Qwen3.6-27B, prompt v4 (rules 1-14 + 5 worked examples)</w:t>
+            </w:r>
+          </w:p>
+        </w:tc>
+        <w:tc>
+          <w:tcPr>
+            <w:tcW w:type="dxa" w:w="1361"/>
+          </w:tcPr>
+          <w:p>
+            <w:r/>
+            <w:r>
+              <w:rPr>
+                <w:b/>
+                <w:sz w:val="17"/>
+              </w:rPr>
+              <w:t>0</w:t>
+            </w:r>
+          </w:p>
+        </w:tc>
+        <w:tc>
+          <w:tcPr>
+            <w:tcW w:type="dxa" w:w="907"/>
+          </w:tcPr>
+          <w:p>
+            <w:r/>
+            <w:r>
+              <w:rPr>
+                <w:b/>
+                <w:sz w:val="17"/>
+              </w:rPr>
+              <w:t>87</w:t>
+            </w:r>
+          </w:p>
+        </w:tc>
+        <w:tc>
+          <w:tcPr>
+            <w:tcW w:type="dxa" w:w="964"/>
+          </w:tcPr>
+          <w:p>
+            <w:r/>
+            <w:r>
+              <w:rPr>
+                <w:b/>
+                <w:sz w:val="17"/>
+              </w:rPr>
+              <w:t>13</w:t>
+            </w:r>
+          </w:p>
+        </w:tc>
+        <w:tc>
+          <w:tcPr>
+            <w:tcW w:type="dxa" w:w="964"/>
+          </w:tcPr>
+          <w:p>
+            <w:r/>
+            <w:r>
+              <w:rPr>
+                <w:b/>
+                <w:sz w:val="17"/>
+              </w:rPr>
+              <w:t>0</w:t>
+            </w:r>
+          </w:p>
+        </w:tc>
+        <w:tc>
+          <w:tcPr>
+            <w:tcW w:type="dxa" w:w="2041"/>
+          </w:tcPr>
+          <w:p>
+            <w:r/>
+            <w:r>
+              <w:rPr>
+                <w:b/>
+                <w:sz w:val="17"/>
+              </w:rPr>
+              <w:t>Yes, by 2 queries</w:t>
+            </w:r>
+          </w:p>
+        </w:tc>
+      </w:tr>
+    </w:tbl>
+    <w:p/>
+    <w:p>
+      <w:pPr>
+        <w:pStyle w:val="ListBullet"/>
+      </w:pPr>
+      <w:r>
+        <w:rPr>
+          <w:b/>
+        </w:rPr>
+        <w:t>Caveat:</w:t>
+      </w:r>
+      <w:r>
+        <w:t xml:space="preserve"> Labels were assigned by an AI assistant (Claude), not by the student or the instructor, and were on the lenient side. Six "Correct" queries contain image details that were hard to verify (queries #47, #48, #57, #76, #93, #94 of the audit sheet); three of them being re-labelled would bring the result below 85%. An official audit by the student/instructor is still required, and the same &gt;= 85% check is required on ~100 CIRR queries.</w:t>
+      </w:r>
+    </w:p>
+    <w:p>
+      <w:pPr>
+        <w:pStyle w:val="ListBullet"/>
+      </w:pPr>
+      <w:r>
+        <w:rPr>
+          <w:b/>
+        </w:rPr>
+        <w:t>Deviations from Sec. 5.2:</w:t>
+      </w:r>
+      <w:r>
+        <w:t xml:space="preserve"> the Sec. 5.2 prompt as written made the 7B model return a bare JSON array without the "target" key (the {"target", "atoms"} wrapper is only stated in Sec. 5.1), so 220/220 outputs were unparseable. The prompt used adds, without changing rules 1-8: the operation definitions, the Sec. 5.1 output format, rules 9-14 (merge swaps into one REPLACE; unused fields null; never swap source and target; ADD has target only; viewpoint/zoom/colour-mode/style changes are atoms; do not invent objects) and five worked examples written for this purpose (none taken from CIRCO or CIRR). A version with six further stacked rules (v3) made the 7B model worse and was discarded. The prompt was tuned on decomposition correctness only, never on retrieval metrics.</w:t>
+      </w:r>
+    </w:p>
+    <w:p>
+      <w:pPr>
+        <w:pStyle w:val="ListBullet"/>
+      </w:pPr>
+      <w:r>
+        <w:rPr>
+          <w:b/>
+        </w:rPr>
+        <w:t>Model actually used:</w:t>
+      </w:r>
+      <w:r>
+        <w:t xml:space="preserve"> Qwen3.6-27B (the factorizer used in the TAPR paper), 4-bit quantized (bitsandbytes), thinking mode off, greedy decoding, one call per query, about 15 s per query on an RTX 3090.</w:t>
+      </w:r>
+    </w:p>
+    <w:p>
+      <w:pPr>
+        <w:pStyle w:val="Heading2"/>
+      </w:pPr>
+      <w:r>
+        <w:t>16.3 Retrieval results</w:t>
+      </w:r>
+    </w:p>
+    <w:p>
+      <w:r>
+        <w:rPr>
+          <w:b w:val="0"/>
+          <w:i w:val="0"/>
+        </w:rPr>
+        <w:t>Setting: frozen OpenCLIP ViT-L/14 (laion2b_s32b_b82k), 1 global + 8x8 local vectors, reference image excluded from the ranking, defaults tau_g = tau_m = 0.02, lambda_edit = 0.5, beta = 10. E0 uses tau = 0.02 and equal weights theta_T = theta_A = theta_P = theta_R = 1, a placeholder because the TAPR paper does not publish numeric values.</w:t>
+      </w:r>
+    </w:p>
+    <w:tbl>
+      <w:tblPr>
+        <w:tblStyle w:val="TableGrid"/>
+        <w:tblW w:type="auto" w:w="0"/>
+        <w:jc w:val="center"/>
+        <w:tblLayout w:type="fixed"/>
+        <w:tblLook w:firstColumn="1" w:firstRow="1" w:lastColumn="0" w:lastRow="0" w:noHBand="0" w:noVBand="1" w:val="04A0"/>
+      </w:tblPr>
+      <w:tblGrid>
+        <w:gridCol w:w="2016"/>
+        <w:gridCol w:w="2016"/>
+        <w:gridCol w:w="2016"/>
+        <w:gridCol w:w="2016"/>
+        <w:gridCol w:w="2016"/>
+      </w:tblGrid>
+      <w:tr>
+        <w:tc>
+          <w:tcPr>
+            <w:tcW w:type="dxa" w:w="4535"/>
+            <w:shd w:val="clear" w:color="auto" w:fill="D9E2F3"/>
+          </w:tcPr>
+          <w:p>
+            <w:r/>
+            <w:r>
+              <w:rPr>
+                <w:b/>
+                <w:sz w:val="17"/>
+              </w:rPr>
+              <w:t>Method (CIRCO val, mAP in %)</w:t>
+            </w:r>
+          </w:p>
+        </w:tc>
+        <w:tc>
+          <w:tcPr>
+            <w:tcW w:type="dxa" w:w="1304"/>
+            <w:shd w:val="clear" w:color="auto" w:fill="D9E2F3"/>
+          </w:tcPr>
+          <w:p>
+            <w:r/>
+            <w:r>
+              <w:rPr>
+                <w:b/>
+                <w:sz w:val="17"/>
+              </w:rPr>
+              <w:t>mAP@5</w:t>
+            </w:r>
+          </w:p>
+        </w:tc>
+        <w:tc>
+          <w:tcPr>
+            <w:tcW w:type="dxa" w:w="1304"/>
+            <w:shd w:val="clear" w:color="auto" w:fill="D9E2F3"/>
+          </w:tcPr>
+          <w:p>
+            <w:r/>
+            <w:r>
+              <w:rPr>
+                <w:b/>
+                <w:sz w:val="17"/>
+              </w:rPr>
+              <w:t>mAP@10</w:t>
+            </w:r>
+          </w:p>
+        </w:tc>
+        <w:tc>
+          <w:tcPr>
+            <w:tcW w:type="dxa" w:w="1304"/>
+            <w:shd w:val="clear" w:color="auto" w:fill="D9E2F3"/>
+          </w:tcPr>
+          <w:p>
+            <w:r/>
+            <w:r>
+              <w:rPr>
+                <w:b/>
+                <w:sz w:val="17"/>
+              </w:rPr>
+              <w:t>mAP@25</w:t>
+            </w:r>
+          </w:p>
+        </w:tc>
+        <w:tc>
+          <w:tcPr>
+            <w:tcW w:type="dxa" w:w="1304"/>
+            <w:shd w:val="clear" w:color="auto" w:fill="D9E2F3"/>
+          </w:tcPr>
+          <w:p>
+            <w:r/>
+            <w:r>
+              <w:rPr>
+                <w:b/>
+                <w:sz w:val="17"/>
+              </w:rPr>
+              <w:t>mAP@50</w:t>
+            </w:r>
+          </w:p>
+        </w:tc>
+      </w:tr>
+      <w:tr>
+        <w:tc>
+          <w:tcPr>
+            <w:tcW w:type="dxa" w:w="4535"/>
+          </w:tcPr>
+          <w:p>
+            <w:r/>
+            <w:r>
+              <w:rPr>
+                <w:b w:val="0"/>
+                <w:sz w:val="17"/>
+              </w:rPr>
+              <w:t>Raw modification text only (no compiler)</w:t>
+            </w:r>
+          </w:p>
+        </w:tc>
+        <w:tc>
+          <w:tcPr>
+            <w:tcW w:type="dxa" w:w="1304"/>
+          </w:tcPr>
+          <w:p>
+            <w:r/>
+            <w:r>
+              <w:rPr>
+                <w:b w:val="0"/>
+                <w:sz w:val="17"/>
+              </w:rPr>
+              <w:t>13.88</w:t>
+            </w:r>
+          </w:p>
+        </w:tc>
+        <w:tc>
+          <w:tcPr>
+            <w:tcW w:type="dxa" w:w="1304"/>
+          </w:tcPr>
+          <w:p>
+            <w:r/>
+            <w:r>
+              <w:rPr>
+                <w:b w:val="0"/>
+                <w:sz w:val="17"/>
+              </w:rPr>
+              <w:t>14.43</w:t>
+            </w:r>
+          </w:p>
+        </w:tc>
+        <w:tc>
+          <w:tcPr>
+            <w:tcW w:type="dxa" w:w="1304"/>
+          </w:tcPr>
+          <w:p>
+            <w:r/>
+            <w:r>
+              <w:rPr>
+                <w:b w:val="0"/>
+                <w:sz w:val="17"/>
+              </w:rPr>
+              <w:t>15.82</w:t>
+            </w:r>
+          </w:p>
+        </w:tc>
+        <w:tc>
+          <w:tcPr>
+            <w:tcW w:type="dxa" w:w="1304"/>
+          </w:tcPr>
+          <w:p>
+            <w:r/>
+            <w:r>
+              <w:rPr>
+                <w:b w:val="0"/>
+                <w:sz w:val="17"/>
+              </w:rPr>
+              <w:t>16.55</w:t>
+            </w:r>
+          </w:p>
+        </w:tc>
+      </w:tr>
+      <w:tr>
+        <w:tc>
+          <w:tcPr>
+            <w:tcW w:type="dxa" w:w="4535"/>
+          </w:tcPr>
+          <w:p>
+            <w:r/>
+            <w:r>
+              <w:rPr>
+                <w:b w:val="0"/>
+                <w:sz w:val="17"/>
+              </w:rPr>
+              <w:t>E0 with 7B compiler (prompt v4)</w:t>
+            </w:r>
+          </w:p>
+        </w:tc>
+        <w:tc>
+          <w:tcPr>
+            <w:tcW w:type="dxa" w:w="1304"/>
+          </w:tcPr>
+          <w:p>
+            <w:r/>
+            <w:r>
+              <w:rPr>
+                <w:b w:val="0"/>
+                <w:sz w:val="17"/>
+              </w:rPr>
+              <w:t>25.19</w:t>
+            </w:r>
+          </w:p>
+        </w:tc>
+        <w:tc>
+          <w:tcPr>
+            <w:tcW w:type="dxa" w:w="1304"/>
+          </w:tcPr>
+          <w:p>
+            <w:r/>
+            <w:r>
+              <w:rPr>
+                <w:b w:val="0"/>
+                <w:sz w:val="17"/>
+              </w:rPr>
+              <w:t>25.93</w:t>
+            </w:r>
+          </w:p>
+        </w:tc>
+        <w:tc>
+          <w:tcPr>
+            <w:tcW w:type="dxa" w:w="1304"/>
+          </w:tcPr>
+          <w:p>
+            <w:r/>
+            <w:r>
+              <w:rPr>
+                <w:b w:val="0"/>
+                <w:sz w:val="17"/>
+              </w:rPr>
+              <w:t>28.33</w:t>
+            </w:r>
+          </w:p>
+        </w:tc>
+        <w:tc>
+          <w:tcPr>
+            <w:tcW w:type="dxa" w:w="1304"/>
+          </w:tcPr>
+          <w:p>
+            <w:r/>
+            <w:r>
+              <w:rPr>
+                <w:b w:val="0"/>
+                <w:sz w:val="17"/>
+              </w:rPr>
+              <w:t>29.26</w:t>
+            </w:r>
+          </w:p>
+        </w:tc>
+      </w:tr>
+      <w:tr>
+        <w:tc>
+          <w:tcPr>
+            <w:tcW w:type="dxa" w:w="4535"/>
+          </w:tcPr>
+          <w:p>
+            <w:r/>
+            <w:r>
+              <w:rPr>
+                <w:b/>
+                <w:sz w:val="17"/>
+              </w:rPr>
+              <w:t>E0 TAPR-style (27B compiler)</w:t>
+            </w:r>
+          </w:p>
+        </w:tc>
+        <w:tc>
+          <w:tcPr>
+            <w:tcW w:type="dxa" w:w="1304"/>
+          </w:tcPr>
+          <w:p>
+            <w:r/>
+            <w:r>
+              <w:rPr>
+                <w:b/>
+                <w:sz w:val="17"/>
+              </w:rPr>
+              <w:t>26.49</w:t>
+            </w:r>
+          </w:p>
+        </w:tc>
+        <w:tc>
+          <w:tcPr>
+            <w:tcW w:type="dxa" w:w="1304"/>
+          </w:tcPr>
+          <w:p>
+            <w:r/>
+            <w:r>
+              <w:rPr>
+                <w:b/>
+                <w:sz w:val="17"/>
+              </w:rPr>
+              <w:t>28.12</w:t>
+            </w:r>
+          </w:p>
+        </w:tc>
+        <w:tc>
+          <w:tcPr>
+            <w:tcW w:type="dxa" w:w="1304"/>
+          </w:tcPr>
+          <w:p>
+            <w:r/>
+            <w:r>
+              <w:rPr>
+                <w:b/>
+                <w:sz w:val="17"/>
+              </w:rPr>
+              <w:t>30.18</w:t>
+            </w:r>
+          </w:p>
+        </w:tc>
+        <w:tc>
+          <w:tcPr>
+            <w:tcW w:type="dxa" w:w="1304"/>
+          </w:tcPr>
+          <w:p>
+            <w:r/>
+            <w:r>
+              <w:rPr>
+                <w:b/>
+                <w:sz w:val="17"/>
+              </w:rPr>
+              <w:t>31.04</w:t>
+            </w:r>
+          </w:p>
+        </w:tc>
+      </w:tr>
+      <w:tr>
+        <w:tc>
+          <w:tcPr>
+            <w:tcW w:type="dxa" w:w="4535"/>
+          </w:tcPr>
+          <w:p>
+            <w:r/>
+            <w:r>
+              <w:rPr>
+                <w:b w:val="0"/>
+                <w:sz w:val="17"/>
+              </w:rPr>
+              <w:t>E1 Transition atoms</w:t>
+            </w:r>
+          </w:p>
+        </w:tc>
+        <w:tc>
+          <w:tcPr>
+            <w:tcW w:type="dxa" w:w="1304"/>
+          </w:tcPr>
+          <w:p>
+            <w:r/>
+            <w:r>
+              <w:rPr>
+                <w:b w:val="0"/>
+                <w:sz w:val="17"/>
+              </w:rPr>
+              <w:t>24.51</w:t>
+            </w:r>
+          </w:p>
+        </w:tc>
+        <w:tc>
+          <w:tcPr>
+            <w:tcW w:type="dxa" w:w="1304"/>
+          </w:tcPr>
+          <w:p>
+            <w:r/>
+            <w:r>
+              <w:rPr>
+                <w:b w:val="0"/>
+                <w:sz w:val="17"/>
+              </w:rPr>
+              <w:t>25.61</w:t>
+            </w:r>
+          </w:p>
+        </w:tc>
+        <w:tc>
+          <w:tcPr>
+            <w:tcW w:type="dxa" w:w="1304"/>
+          </w:tcPr>
+          <w:p>
+            <w:r/>
+            <w:r>
+              <w:rPr>
+                <w:b w:val="0"/>
+                <w:sz w:val="17"/>
+              </w:rPr>
+              <w:t>27.79</w:t>
+            </w:r>
+          </w:p>
+        </w:tc>
+        <w:tc>
+          <w:tcPr>
+            <w:tcW w:type="dxa" w:w="1304"/>
+          </w:tcPr>
+          <w:p>
+            <w:r/>
+            <w:r>
+              <w:rPr>
+                <w:b w:val="0"/>
+                <w:sz w:val="17"/>
+              </w:rPr>
+              <w:t>28.64</w:t>
+            </w:r>
+          </w:p>
+        </w:tc>
+      </w:tr>
+      <w:tr>
+        <w:tc>
+          <w:tcPr>
+            <w:tcW w:type="dxa" w:w="4535"/>
+          </w:tcPr>
+          <w:p>
+            <w:r/>
+            <w:r>
+              <w:rPr>
+                <w:b w:val="0"/>
+                <w:sz w:val="17"/>
+              </w:rPr>
+              <w:t>E2 + Source grounding</w:t>
+            </w:r>
+          </w:p>
+        </w:tc>
+        <w:tc>
+          <w:tcPr>
+            <w:tcW w:type="dxa" w:w="1304"/>
+          </w:tcPr>
+          <w:p>
+            <w:r/>
+            <w:r>
+              <w:rPr>
+                <w:b w:val="0"/>
+                <w:sz w:val="17"/>
+              </w:rPr>
+              <w:t>25.18</w:t>
+            </w:r>
+          </w:p>
+        </w:tc>
+        <w:tc>
+          <w:tcPr>
+            <w:tcW w:type="dxa" w:w="1304"/>
+          </w:tcPr>
+          <w:p>
+            <w:r/>
+            <w:r>
+              <w:rPr>
+                <w:b w:val="0"/>
+                <w:sz w:val="17"/>
+              </w:rPr>
+              <w:t>26.33</w:t>
+            </w:r>
+          </w:p>
+        </w:tc>
+        <w:tc>
+          <w:tcPr>
+            <w:tcW w:type="dxa" w:w="1304"/>
+          </w:tcPr>
+          <w:p>
+            <w:r/>
+            <w:r>
+              <w:rPr>
+                <w:b w:val="0"/>
+                <w:sz w:val="17"/>
+              </w:rPr>
+              <w:t>28.48</w:t>
+            </w:r>
+          </w:p>
+        </w:tc>
+        <w:tc>
+          <w:tcPr>
+            <w:tcW w:type="dxa" w:w="1304"/>
+          </w:tcPr>
+          <w:p>
+            <w:r/>
+            <w:r>
+              <w:rPr>
+                <w:b w:val="0"/>
+                <w:sz w:val="17"/>
+              </w:rPr>
+              <w:t>29.25</w:t>
+            </w:r>
+          </w:p>
+        </w:tc>
+      </w:tr>
+      <w:tr>
+        <w:tc>
+          <w:tcPr>
+            <w:tcW w:type="dxa" w:w="4535"/>
+          </w:tcPr>
+          <w:p>
+            <w:r/>
+            <w:r>
+              <w:rPr>
+                <w:b w:val="0"/>
+                <w:sz w:val="17"/>
+              </w:rPr>
+              <w:t>E3 + Local delta</w:t>
+            </w:r>
+          </w:p>
+        </w:tc>
+        <w:tc>
+          <w:tcPr>
+            <w:tcW w:type="dxa" w:w="1304"/>
+          </w:tcPr>
+          <w:p>
+            <w:r/>
+            <w:r>
+              <w:rPr>
+                <w:b w:val="0"/>
+                <w:sz w:val="17"/>
+              </w:rPr>
+              <w:t>23.34</w:t>
+            </w:r>
+          </w:p>
+        </w:tc>
+        <w:tc>
+          <w:tcPr>
+            <w:tcW w:type="dxa" w:w="1304"/>
+          </w:tcPr>
+          <w:p>
+            <w:r/>
+            <w:r>
+              <w:rPr>
+                <w:b w:val="0"/>
+                <w:sz w:val="17"/>
+              </w:rPr>
+              <w:t>25.05</w:t>
+            </w:r>
+          </w:p>
+        </w:tc>
+        <w:tc>
+          <w:tcPr>
+            <w:tcW w:type="dxa" w:w="1304"/>
+          </w:tcPr>
+          <w:p>
+            <w:r/>
+            <w:r>
+              <w:rPr>
+                <w:b w:val="0"/>
+                <w:sz w:val="17"/>
+              </w:rPr>
+              <w:t>27.04</w:t>
+            </w:r>
+          </w:p>
+        </w:tc>
+        <w:tc>
+          <w:tcPr>
+            <w:tcW w:type="dxa" w:w="1304"/>
+          </w:tcPr>
+          <w:p>
+            <w:r/>
+            <w:r>
+              <w:rPr>
+                <w:b w:val="0"/>
+                <w:sz w:val="17"/>
+              </w:rPr>
+              <w:t>27.74</w:t>
+            </w:r>
+          </w:p>
+        </w:tc>
+      </w:tr>
+      <w:tr>
+        <w:tc>
+          <w:tcPr>
+            <w:tcW w:type="dxa" w:w="4535"/>
+          </w:tcPr>
+          <w:p>
+            <w:r/>
+            <w:r>
+              <w:rPr>
+                <w:b/>
+                <w:sz w:val="17"/>
+              </w:rPr>
+              <w:t>E4 Full P0 (coupled REPLACE)</w:t>
+            </w:r>
+          </w:p>
+        </w:tc>
+        <w:tc>
+          <w:tcPr>
+            <w:tcW w:type="dxa" w:w="1304"/>
+          </w:tcPr>
+          <w:p>
+            <w:r/>
+            <w:r>
+              <w:rPr>
+                <w:b/>
+                <w:sz w:val="17"/>
+              </w:rPr>
+              <w:t>25.36</w:t>
+            </w:r>
+          </w:p>
+        </w:tc>
+        <w:tc>
+          <w:tcPr>
+            <w:tcW w:type="dxa" w:w="1304"/>
+          </w:tcPr>
+          <w:p>
+            <w:r/>
+            <w:r>
+              <w:rPr>
+                <w:b/>
+                <w:sz w:val="17"/>
+              </w:rPr>
+              <w:t>26.70</w:t>
+            </w:r>
+          </w:p>
+        </w:tc>
+        <w:tc>
+          <w:tcPr>
+            <w:tcW w:type="dxa" w:w="1304"/>
+          </w:tcPr>
+          <w:p>
+            <w:r/>
+            <w:r>
+              <w:rPr>
+                <w:b/>
+                <w:sz w:val="17"/>
+              </w:rPr>
+              <w:t>28.91</w:t>
+            </w:r>
+          </w:p>
+        </w:tc>
+        <w:tc>
+          <w:tcPr>
+            <w:tcW w:type="dxa" w:w="1304"/>
+          </w:tcPr>
+          <w:p>
+            <w:r/>
+            <w:r>
+              <w:rPr>
+                <w:b/>
+                <w:sz w:val="17"/>
+              </w:rPr>
+              <w:t>29.66</w:t>
+            </w:r>
+          </w:p>
+        </w:tc>
+      </w:tr>
+      <w:tr>
+        <w:tc>
+          <w:tcPr>
+            <w:tcW w:type="dxa" w:w="4535"/>
+          </w:tcPr>
+          <w:p>
+            <w:r/>
+            <w:r>
+              <w:rPr>
+                <w:b w:val="0"/>
+                <w:sz w:val="17"/>
+              </w:rPr>
+              <w:t>Reference only: TAPR paper, ViT-L, CIRCO test set</w:t>
+            </w:r>
+          </w:p>
+        </w:tc>
+        <w:tc>
+          <w:tcPr>
+            <w:tcW w:type="dxa" w:w="1304"/>
+          </w:tcPr>
+          <w:p>
+            <w:r/>
+            <w:r>
+              <w:rPr>
+                <w:b w:val="0"/>
+                <w:sz w:val="17"/>
+              </w:rPr>
+              <w:t>37.83</w:t>
+            </w:r>
+          </w:p>
+        </w:tc>
+        <w:tc>
+          <w:tcPr>
+            <w:tcW w:type="dxa" w:w="1304"/>
+          </w:tcPr>
+          <w:p>
+            <w:r/>
+            <w:r>
+              <w:rPr>
+                <w:b w:val="0"/>
+                <w:sz w:val="17"/>
+              </w:rPr>
+              <w:t>38.46</w:t>
+            </w:r>
+          </w:p>
+        </w:tc>
+        <w:tc>
+          <w:tcPr>
+            <w:tcW w:type="dxa" w:w="1304"/>
+          </w:tcPr>
+          <w:p>
+            <w:r/>
+            <w:r>
+              <w:rPr>
+                <w:b w:val="0"/>
+                <w:sz w:val="17"/>
+              </w:rPr>
+              <w:t>41.44</w:t>
+            </w:r>
+          </w:p>
+        </w:tc>
+        <w:tc>
+          <w:tcPr>
+            <w:tcW w:type="dxa" w:w="1304"/>
+          </w:tcPr>
+          <w:p>
+            <w:r/>
+            <w:r>
+              <w:rPr>
+                <w:b w:val="0"/>
+                <w:sz w:val="17"/>
+              </w:rPr>
+              <w:t>42.50</w:t>
+            </w:r>
+          </w:p>
+        </w:tc>
+      </w:tr>
+    </w:tbl>
+    <w:p/>
+    <w:p>
+      <w:r>
+        <w:rPr>
+          <w:b w:val="0"/>
+          <w:i/>
+        </w:rPr>
+        <w:t>The last row is the published test-set result and is not directly comparable to the 220-query validation set; the gap of about 11 mAP@5 points may come from the different split and from the placeholder E0 weights (not separated).</w:t>
+      </w:r>
+    </w:p>
+    <w:p>
+      <w:r>
+        <w:rPr>
+          <w:b/>
+          <w:i w:val="0"/>
+        </w:rPr>
+        <w:t>Paired per-query AP differences (bootstrap, 10,000 resamples; difference in mAP points and 95% CI):</w:t>
+      </w:r>
+    </w:p>
+    <w:tbl>
+      <w:tblPr>
+        <w:tblStyle w:val="TableGrid"/>
+        <w:tblW w:type="auto" w:w="0"/>
+        <w:jc w:val="center"/>
+        <w:tblLayout w:type="fixed"/>
+        <w:tblLook w:firstColumn="1" w:firstRow="1" w:lastColumn="0" w:lastRow="0" w:noHBand="0" w:noVBand="1" w:val="04A0"/>
+      </w:tblPr>
+      <w:tblGrid>
+        <w:gridCol w:w="3360"/>
+        <w:gridCol w:w="3360"/>
+        <w:gridCol w:w="3360"/>
+      </w:tblGrid>
+      <w:tr>
+        <w:tc>
+          <w:tcPr>
+            <w:tcW w:type="dxa" w:w="4535"/>
+            <w:shd w:val="clear" w:color="auto" w:fill="D9E2F3"/>
+          </w:tcPr>
+          <w:p>
+            <w:r/>
+            <w:r>
+              <w:rPr>
+                <w:b/>
+                <w:sz w:val="17"/>
+              </w:rPr>
+              <w:t>Comparison</w:t>
+            </w:r>
+          </w:p>
+        </w:tc>
+        <w:tc>
+          <w:tcPr>
+            <w:tcW w:type="dxa" w:w="2494"/>
+            <w:shd w:val="clear" w:color="auto" w:fill="D9E2F3"/>
+          </w:tcPr>
+          <w:p>
+            <w:r/>
+            <w:r>
+              <w:rPr>
+                <w:b/>
+                <w:sz w:val="17"/>
+              </w:rPr>
+              <w:t>mAP@5</w:t>
+            </w:r>
+          </w:p>
+        </w:tc>
+        <w:tc>
+          <w:tcPr>
+            <w:tcW w:type="dxa" w:w="2494"/>
+            <w:shd w:val="clear" w:color="auto" w:fill="D9E2F3"/>
+          </w:tcPr>
+          <w:p>
+            <w:r/>
+            <w:r>
+              <w:rPr>
+                <w:b/>
+                <w:sz w:val="17"/>
+              </w:rPr>
+              <w:t>mAP@10</w:t>
+            </w:r>
+          </w:p>
+        </w:tc>
+      </w:tr>
+      <w:tr>
+        <w:tc>
+          <w:tcPr>
+            <w:tcW w:type="dxa" w:w="4535"/>
+          </w:tcPr>
+          <w:p>
+            <w:r/>
+            <w:r>
+              <w:rPr>
+                <w:b w:val="0"/>
+                <w:sz w:val="17"/>
+              </w:rPr>
+              <w:t>E1 - E0 (H1)</w:t>
+            </w:r>
+          </w:p>
+        </w:tc>
+        <w:tc>
+          <w:tcPr>
+            <w:tcW w:type="dxa" w:w="2494"/>
+          </w:tcPr>
+          <w:p>
+            <w:r/>
+            <w:r>
+              <w:rPr>
+                <w:b w:val="0"/>
+                <w:sz w:val="17"/>
+              </w:rPr>
+              <w:t>-1.98 [-4.78, +0.77]</w:t>
+            </w:r>
+          </w:p>
+        </w:tc>
+        <w:tc>
+          <w:tcPr>
+            <w:tcW w:type="dxa" w:w="2494"/>
+          </w:tcPr>
+          <w:p>
+            <w:r/>
+            <w:r>
+              <w:rPr>
+                <w:b w:val="0"/>
+                <w:sz w:val="17"/>
+              </w:rPr>
+              <w:t>-2.51 [-5.11, +0.06]</w:t>
+            </w:r>
+          </w:p>
+        </w:tc>
+      </w:tr>
+      <w:tr>
+        <w:tc>
+          <w:tcPr>
+            <w:tcW w:type="dxa" w:w="4535"/>
+          </w:tcPr>
+          <w:p>
+            <w:r/>
+            <w:r>
+              <w:rPr>
+                <w:b w:val="0"/>
+                <w:sz w:val="17"/>
+              </w:rPr>
+              <w:t>E2 - E1 (source grounding)</w:t>
+            </w:r>
+          </w:p>
+        </w:tc>
+        <w:tc>
+          <w:tcPr>
+            <w:tcW w:type="dxa" w:w="2494"/>
+          </w:tcPr>
+          <w:p>
+            <w:r/>
+            <w:r>
+              <w:rPr>
+                <w:b w:val="0"/>
+                <w:sz w:val="17"/>
+              </w:rPr>
+              <w:t>+0.67 [-0.02, +1.45]</w:t>
+            </w:r>
+          </w:p>
+        </w:tc>
+        <w:tc>
+          <w:tcPr>
+            <w:tcW w:type="dxa" w:w="2494"/>
+          </w:tcPr>
+          <w:p>
+            <w:r/>
+            <w:r>
+              <w:rPr>
+                <w:b w:val="0"/>
+                <w:sz w:val="17"/>
+              </w:rPr>
+              <w:t>+0.72 [+0.09, +1.45]</w:t>
+            </w:r>
+          </w:p>
+        </w:tc>
+      </w:tr>
+      <w:tr>
+        <w:tc>
+          <w:tcPr>
+            <w:tcW w:type="dxa" w:w="4535"/>
+          </w:tcPr>
+          <w:p>
+            <w:r/>
+            <w:r>
+              <w:rPr>
+                <w:b w:val="0"/>
+                <w:sz w:val="17"/>
+              </w:rPr>
+              <w:t>E3 - E2 (delta, z- also for REPLACE)</w:t>
+            </w:r>
+          </w:p>
+        </w:tc>
+        <w:tc>
+          <w:tcPr>
+            <w:tcW w:type="dxa" w:w="2494"/>
+          </w:tcPr>
+          <w:p>
+            <w:r/>
+            <w:r>
+              <w:rPr>
+                <w:b w:val="0"/>
+                <w:sz w:val="17"/>
+              </w:rPr>
+              <w:t>-1.84 [-3.25, -0.53]</w:t>
+            </w:r>
+          </w:p>
+        </w:tc>
+        <w:tc>
+          <w:tcPr>
+            <w:tcW w:type="dxa" w:w="2494"/>
+          </w:tcPr>
+          <w:p>
+            <w:r/>
+            <w:r>
+              <w:rPr>
+                <w:b w:val="0"/>
+                <w:sz w:val="17"/>
+              </w:rPr>
+              <w:t>-1.28 [-2.53, -0.19]</w:t>
+            </w:r>
+          </w:p>
+        </w:tc>
+      </w:tr>
+      <w:tr>
+        <w:tc>
+          <w:tcPr>
+            <w:tcW w:type="dxa" w:w="4535"/>
+          </w:tcPr>
+          <w:p>
+            <w:r/>
+            <w:r>
+              <w:rPr>
+                <w:b/>
+                <w:sz w:val="17"/>
+              </w:rPr>
+              <w:t>E4 - E3 (coupled vs summed REPLACE; H3)</w:t>
+            </w:r>
+          </w:p>
+        </w:tc>
+        <w:tc>
+          <w:tcPr>
+            <w:tcW w:type="dxa" w:w="2494"/>
+          </w:tcPr>
+          <w:p>
+            <w:r/>
+            <w:r>
+              <w:rPr>
+                <w:b/>
+                <w:sz w:val="17"/>
+              </w:rPr>
+              <w:t>+2.02 [+0.79, +3.46]</w:t>
+            </w:r>
+          </w:p>
+        </w:tc>
+        <w:tc>
+          <w:tcPr>
+            <w:tcW w:type="dxa" w:w="2494"/>
+          </w:tcPr>
+          <w:p>
+            <w:r/>
+            <w:r>
+              <w:rPr>
+                <w:b/>
+                <w:sz w:val="17"/>
+              </w:rPr>
+              <w:t>+1.65 [+0.50, +2.99]</w:t>
+            </w:r>
+          </w:p>
+        </w:tc>
+      </w:tr>
+      <w:tr>
+        <w:tc>
+          <w:tcPr>
+            <w:tcW w:type="dxa" w:w="4535"/>
+          </w:tcPr>
+          <w:p>
+            <w:r/>
+            <w:r>
+              <w:rPr>
+                <w:b w:val="0"/>
+                <w:sz w:val="17"/>
+              </w:rPr>
+              <w:t>E4 - E2</w:t>
+            </w:r>
+          </w:p>
+        </w:tc>
+        <w:tc>
+          <w:tcPr>
+            <w:tcW w:type="dxa" w:w="2494"/>
+          </w:tcPr>
+          <w:p>
+            <w:r/>
+            <w:r>
+              <w:rPr>
+                <w:b w:val="0"/>
+                <w:sz w:val="17"/>
+              </w:rPr>
+              <w:t>+0.18 [-0.68, +1.12]</w:t>
+            </w:r>
+          </w:p>
+        </w:tc>
+        <w:tc>
+          <w:tcPr>
+            <w:tcW w:type="dxa" w:w="2494"/>
+          </w:tcPr>
+          <w:p>
+            <w:r/>
+            <w:r>
+              <w:rPr>
+                <w:b w:val="0"/>
+                <w:sz w:val="17"/>
+              </w:rPr>
+              <w:t>+0.37 [-0.41, +1.22]</w:t>
+            </w:r>
+          </w:p>
+        </w:tc>
+      </w:tr>
+      <w:tr>
+        <w:tc>
+          <w:tcPr>
+            <w:tcW w:type="dxa" w:w="4535"/>
+          </w:tcPr>
+          <w:p>
+            <w:r/>
+            <w:r>
+              <w:rPr>
+                <w:b w:val="0"/>
+                <w:sz w:val="17"/>
+              </w:rPr>
+              <w:t>E4 - E1</w:t>
+            </w:r>
+          </w:p>
+        </w:tc>
+        <w:tc>
+          <w:tcPr>
+            <w:tcW w:type="dxa" w:w="2494"/>
+          </w:tcPr>
+          <w:p>
+            <w:r/>
+            <w:r>
+              <w:rPr>
+                <w:b w:val="0"/>
+                <w:sz w:val="17"/>
+              </w:rPr>
+              <w:t>+0.85 [-0.18, +1.97]</w:t>
+            </w:r>
+          </w:p>
+        </w:tc>
+        <w:tc>
+          <w:tcPr>
+            <w:tcW w:type="dxa" w:w="2494"/>
+          </w:tcPr>
+          <w:p>
+            <w:r/>
+            <w:r>
+              <w:rPr>
+                <w:b w:val="0"/>
+                <w:sz w:val="17"/>
+              </w:rPr>
+              <w:t>+1.10 [+0.12, +2.13]</w:t>
+            </w:r>
+          </w:p>
+        </w:tc>
+      </w:tr>
+      <w:tr>
+        <w:tc>
+          <w:tcPr>
+            <w:tcW w:type="dxa" w:w="4535"/>
+          </w:tcPr>
+          <w:p>
+            <w:r/>
+            <w:r>
+              <w:rPr>
+                <w:b w:val="0"/>
+                <w:sz w:val="17"/>
+              </w:rPr>
+              <w:t>E4 - E0</w:t>
+            </w:r>
+          </w:p>
+        </w:tc>
+        <w:tc>
+          <w:tcPr>
+            <w:tcW w:type="dxa" w:w="2494"/>
+          </w:tcPr>
+          <w:p>
+            <w:r/>
+            <w:r>
+              <w:rPr>
+                <w:b w:val="0"/>
+                <w:sz w:val="17"/>
+              </w:rPr>
+              <w:t>-1.13 [-4.17, +1.88]</w:t>
+            </w:r>
+          </w:p>
+        </w:tc>
+        <w:tc>
+          <w:tcPr>
+            <w:tcW w:type="dxa" w:w="2494"/>
+          </w:tcPr>
+          <w:p>
+            <w:r/>
+            <w:r>
+              <w:rPr>
+                <w:b w:val="0"/>
+                <w:sz w:val="17"/>
+              </w:rPr>
+              <w:t>-1.42 [-4.17, +1.26]</w:t>
+            </w:r>
+          </w:p>
+        </w:tc>
+      </w:tr>
+    </w:tbl>
+    <w:p/>
+    <w:p>
+      <w:r>
+        <w:rPr>
+          <w:b/>
+          <w:i w:val="0"/>
+        </w:rPr>
+        <w:t>Sensitivity grids (E4, mAP@5 / mAP@10; defaults marked *). The grid is reported, not used for selection.</w:t>
+      </w:r>
+    </w:p>
+    <w:tbl>
+      <w:tblPr>
+        <w:tblStyle w:val="TableGrid"/>
+        <w:tblW w:type="auto" w:w="0"/>
+        <w:jc w:val="center"/>
+        <w:tblLayout w:type="fixed"/>
+        <w:tblLook w:firstColumn="1" w:firstRow="1" w:lastColumn="0" w:lastRow="0" w:noHBand="0" w:noVBand="1" w:val="04A0"/>
+      </w:tblPr>
+      <w:tblGrid>
+        <w:gridCol w:w="5040"/>
+        <w:gridCol w:w="5040"/>
+      </w:tblGrid>
+      <w:tr>
+        <w:tc>
+          <w:tcPr>
+            <w:tcW w:type="dxa" w:w="2041"/>
+            <w:shd w:val="clear" w:color="auto" w:fill="D9E2F3"/>
+          </w:tcPr>
+          <w:p>
+            <w:r/>
+            <w:r>
+              <w:rPr>
+                <w:b/>
+                <w:sz w:val="17"/>
+              </w:rPr>
+              <w:t>Parameter</w:t>
+            </w:r>
+          </w:p>
+        </w:tc>
+        <w:tc>
+          <w:tcPr>
+            <w:tcW w:type="dxa" w:w="8050"/>
+            <w:shd w:val="clear" w:color="auto" w:fill="D9E2F3"/>
+          </w:tcPr>
+          <w:p>
+            <w:r/>
+            <w:r>
+              <w:rPr>
+                <w:b/>
+                <w:sz w:val="17"/>
+              </w:rPr>
+              <w:t>Values</w:t>
+            </w:r>
+          </w:p>
+        </w:tc>
+      </w:tr>
+      <w:tr>
+        <w:tc>
+          <w:tcPr>
+            <w:tcW w:type="dxa" w:w="2041"/>
+          </w:tcPr>
+          <w:p>
+            <w:r/>
+            <w:r>
+              <w:rPr>
+                <w:b w:val="0"/>
+                <w:sz w:val="17"/>
+              </w:rPr>
+              <w:t>beta</w:t>
+            </w:r>
+          </w:p>
+        </w:tc>
+        <w:tc>
+          <w:tcPr>
+            <w:tcW w:type="dxa" w:w="8050"/>
+          </w:tcPr>
+          <w:p>
+            <w:r/>
+            <w:r>
+              <w:rPr>
+                <w:b w:val="0"/>
+                <w:sz w:val="17"/>
+              </w:rPr>
+              <w:t>5: 24.40 / 25.92;  10*: 25.36 / 26.70;  20: 25.57 / 26.90</w:t>
+            </w:r>
+          </w:p>
+        </w:tc>
+      </w:tr>
+      <w:tr>
+        <w:tc>
+          <w:tcPr>
+            <w:tcW w:type="dxa" w:w="2041"/>
+          </w:tcPr>
+          <w:p>
+            <w:r/>
+            <w:r>
+              <w:rPr>
+                <w:b w:val="0"/>
+                <w:sz w:val="17"/>
+              </w:rPr>
+              <w:t>lambda_edit</w:t>
+            </w:r>
+          </w:p>
+        </w:tc>
+        <w:tc>
+          <w:tcPr>
+            <w:tcW w:type="dxa" w:w="8050"/>
+          </w:tcPr>
+          <w:p>
+            <w:r/>
+            <w:r>
+              <w:rPr>
+                <w:b w:val="0"/>
+                <w:sz w:val="17"/>
+              </w:rPr>
+              <w:t>0.25: 23.82 / 25.37;  0.5*: 25.36 / 26.70;  1.0: 25.24 / 26.51</w:t>
+            </w:r>
+          </w:p>
+        </w:tc>
+      </w:tr>
+      <w:tr>
+        <w:tc>
+          <w:tcPr>
+            <w:tcW w:type="dxa" w:w="2041"/>
+          </w:tcPr>
+          <w:p>
+            <w:r/>
+            <w:r>
+              <w:rPr>
+                <w:b w:val="0"/>
+                <w:sz w:val="17"/>
+              </w:rPr>
+              <w:t>tau_g</w:t>
+            </w:r>
+          </w:p>
+        </w:tc>
+        <w:tc>
+          <w:tcPr>
+            <w:tcW w:type="dxa" w:w="8050"/>
+          </w:tcPr>
+          <w:p>
+            <w:r/>
+            <w:r>
+              <w:rPr>
+                <w:b w:val="0"/>
+                <w:sz w:val="17"/>
+              </w:rPr>
+              <w:t>0.01: 25.37 / 26.73;  0.02*: 25.36 / 26.70;  0.04: 25.17 / 26.64</w:t>
+            </w:r>
+          </w:p>
+        </w:tc>
+      </w:tr>
+      <w:tr>
+        <w:tc>
+          <w:tcPr>
+            <w:tcW w:type="dxa" w:w="2041"/>
+          </w:tcPr>
+          <w:p>
+            <w:r/>
+            <w:r>
+              <w:rPr>
+                <w:b w:val="0"/>
+                <w:sz w:val="17"/>
+              </w:rPr>
+              <w:t>E1, lambda_edit</w:t>
+            </w:r>
+          </w:p>
+        </w:tc>
+        <w:tc>
+          <w:tcPr>
+            <w:tcW w:type="dxa" w:w="8050"/>
+          </w:tcPr>
+          <w:p>
+            <w:r/>
+            <w:r>
+              <w:rPr>
+                <w:b w:val="0"/>
+                <w:sz w:val="17"/>
+              </w:rPr>
+              <w:t>0.25: 23.75 / 25.06;  0.5*: 24.51 / 25.61;  1.0: 24.44 / 25.06</w:t>
+            </w:r>
+          </w:p>
+        </w:tc>
+      </w:tr>
+      <w:tr>
+        <w:tc>
+          <w:tcPr>
+            <w:tcW w:type="dxa" w:w="2041"/>
+          </w:tcPr>
+          <w:p>
+            <w:r/>
+            <w:r>
+              <w:rPr>
+                <w:b w:val="0"/>
+                <w:sz w:val="17"/>
+              </w:rPr>
+              <w:t>E2, tau_g</w:t>
+            </w:r>
+          </w:p>
+        </w:tc>
+        <w:tc>
+          <w:tcPr>
+            <w:tcW w:type="dxa" w:w="8050"/>
+          </w:tcPr>
+          <w:p>
+            <w:r/>
+            <w:r>
+              <w:rPr>
+                <w:b w:val="0"/>
+                <w:sz w:val="17"/>
+              </w:rPr>
+              <w:t>0.01: 25.10 / 26.27;  0.02*: 25.18 / 26.33;  0.04: 25.16 / 26.39 (L2-normalised z-: 25.26 / 26.37)</w:t>
+            </w:r>
+          </w:p>
+        </w:tc>
+      </w:tr>
+    </w:tbl>
+    <w:p/>
+    <w:p>
+      <w:r>
+        <w:rPr>
+          <w:b/>
+          <w:i w:val="0"/>
+        </w:rPr>
+        <w:t>Reading against the hypotheses (CIRCO validation only):</w:t>
+      </w:r>
+    </w:p>
+    <w:p>
+      <w:pPr>
+        <w:pStyle w:val="ListBullet"/>
+      </w:pPr>
+      <w:r>
+        <w:rPr>
+          <w:b/>
+        </w:rPr>
+        <w:t>H1 (atoms &gt; independent factors):</w:t>
+      </w:r>
+      <w:r>
+        <w:t xml:space="preserve"> not supported at the default setting. E1 is below E0 by about 2 points, but the 95% CI includes zero, so E1 is not shown to be worse either. E1 loses mostly on queries with PRESERVE atoms (mAP@5 29.06 vs 23.85), where E0 uses the reference image's local features (continuity term) and E1, by definition, uses only text. This is a hypothesis, not tested.</w:t>
+      </w:r>
+    </w:p>
+    <w:p>
+      <w:pPr>
+        <w:pStyle w:val="ListBullet"/>
+      </w:pPr>
+      <w:r>
+        <w:rPr>
+          <w:b/>
+        </w:rPr>
+        <w:t>H2 (grounded delta &gt; absolute):</w:t>
+      </w:r>
+      <w:r>
+        <w:t xml:space="preserve"> not supported. Grounding the source state (E2) gives a small, borderline gain over text-only source evidence, and using the grounded prototype for REPLACE (E3) is significantly worse than E2. Note that in E3 the sum of deltas differs from absolute matching only by per-query constants (M(u+, I_r), M(z-, I_r)), which never change a ranking, so the relative-vs-absolute distinction cannot matter before the SoftMin of E4.</w:t>
+      </w:r>
+    </w:p>
+    <w:p>
+      <w:pPr>
+        <w:pStyle w:val="ListBullet"/>
+      </w:pPr>
+      <w:r>
+        <w:rPr>
+          <w:b/>
+        </w:rPr>
+        <w:t>H3 (coupled REPLACE):</w:t>
+      </w:r>
+      <w:r>
+        <w:t xml:space="preserve"> supported in the E3-to-E4 comparison: coupling the two sides of REPLACE with SoftMin beats summing them (+2.02 mAP@5, CI excludes 0). E4 is not significantly different from E0 (-1.13, CI [-4.17, +1.88]). Note that H3 as worded (coupled REPLACE vs independent Add + Remove) is tested here through E4 vs E3, not through E0.</w:t>
+      </w:r>
+    </w:p>
+    <w:p>
+      <w:pPr>
+        <w:pStyle w:val="ListBullet"/>
+      </w:pPr>
+      <w:r>
+        <w:rPr>
+          <w:b/>
+        </w:rPr>
+        <w:t>Table 12.2:</w:t>
+      </w:r>
+      <w:r>
+        <w:t xml:space="preserve"> the expected pattern of larger gains on REPLACE/COMPOUND than overall is only weakly visible: E4 vs E0 on REPLACE-only queries is +1.7 mAP@5 (n = 49, not tested) and on COMPOUND +0.5 (n = 144); E4 is behind E0 on queries without REPLACE (-3.9, n = 39). Table 12.2 groups overlap (a query counts in every group whose operation it contains; COMPOUND = at least two non-PRESERVE atoms; groups derived from the 27B compiler output; n = 104 ADD, 26 REMOVE, 96 PRESERVE, 181 REPLACE, 144 COMPOUND) and report CIRCO mAP@5.</w:t>
+      </w:r>
+    </w:p>
+    <w:p>
+      <w:pPr>
+        <w:pStyle w:val="Heading2"/>
+      </w:pPr>
+      <w:r>
+        <w:t>16.4 Grounding diagnostic (Sec. 7 and Sec. 14)</w:t>
+      </w:r>
+    </w:p>
+    <w:p>
+      <w:r>
+        <w:rPr>
+          <w:b w:val="0"/>
+          <w:i w:val="0"/>
+        </w:rPr>
+        <w:t>Heatmaps of the grounding weights alpha over the 8x8 local grid were produced for 12 randomly chosen REMOVE / PRESERVE / REPLACE source phrases (figure below). Over the 189 REMOVE/PRESERVE source phrases of the 220 queries at tau_g = 0.02: mean max alpha = 0.178 (uniform would be 0.016); effective number of patches about 23 of 64; 47% of the alpha mass lies on the outer ring of the grid (44% if uniform). Weights are also diffuse at tau_g = 0.01 (mean max alpha 0.387, about 9 effective patches).</w:t>
+      </w:r>
+    </w:p>
+    <w:p>
+      <w:r>
+        <w:drawing>
+          <wp:inline xmlns:a="http://schemas.openxmlformats.org/drawingml/2006/main" xmlns:pic="http://schemas.openxmlformats.org/drawingml/2006/picture">
+            <wp:extent cx="5760000" cy="5207143"/>
+            <wp:docPr id="1932488473" name="Picture 1932488473"/>
+            <wp:cNvGraphicFramePr>
+              <a:graphicFrameLocks noChangeAspect="1"/>
+            </wp:cNvGraphicFramePr>
+            <a:graphic>
+              <a:graphicData uri="http://schemas.openxmlformats.org/drawingml/2006/picture">
+                <pic:pic>
+                  <pic:nvPicPr>
+                    <pic:cNvPr id="0" name="grounding_heatmaps_e2.png"/>
+                    <pic:cNvPicPr/>
+                  </pic:nvPicPr>
+                  <pic:blipFill>
+                    <a:blip r:embed="rId12"/>
+                    <a:stretch>
+                      <a:fillRect/>
+                    </a:stretch>
+                  </pic:blipFill>
+                  <pic:spPr>
+                    <a:xfrm>
+                      <a:off x="0" y="0"/>
+                      <a:ext cx="5760000" cy="5207143"/>
+                    </a:xfrm>
+                    <a:prstGeom prst="rect"/>
+                  </pic:spPr>
+                </pic:pic>
+              </a:graphicData>
+            </a:graphic>
+          </wp:inline>
+        </w:drawing>
+      </w:r>
+    </w:p>
+    <w:p>
+      <w:r>
+        <w:rPr>
+          <w:b w:val="0"/>
+          <w:i/>
+        </w:rPr>
+        <w:t>Figure 16.1. Grounding heatmaps (red = higher alpha) on the centre crop CLIP sees; caption = operation and source phrase.</w:t>
+      </w:r>
+    </w:p>
+    <w:p>
+      <w:r>
+        <w:rPr>
+          <w:b w:val="0"/>
+          <w:i w:val="0"/>
+        </w:rPr>
+        <w:t>The maps often highlight background or image borders instead of the named object (for example "yellow school bus", "burger", "man in a police uniform"), so z- behaves close to an average of many patches. Sec. 14 says not to proceed to large runs if grounding is clearly unstable or semantically wrong. This diagnostic suggests it is not yet localizing well; a supervisor decision is needed on whether to continue to CIRR as is. Also, the 224 centre crop hides content at the sides of wide images (for example the person in reference query 15), for reference and gallery alike. These are observations; the cause (patch tokens projected through the visual projection) is not verified.</w:t>
+      </w:r>
+    </w:p>
+    <w:p>
+      <w:pPr>
+        <w:pStyle w:val="Heading2"/>
+      </w:pPr>
+      <w:r>
+        <w:t>16.5 Implementation notes and interpretations</w:t>
+      </w:r>
+    </w:p>
+    <w:p>
+      <w:pPr>
+        <w:pStyle w:val="ListBullet"/>
+      </w:pPr>
+      <w:r>
+        <w:t>E1-E4 follow Sec. 8-10 literally: M(u, I) = tau_m log-sum-exp over the 64 local vectors; S = Phi_T + lambda_edit * mean of atom scores; no per-operation weights; no reference-continuity term (E0 has one, as TAPR Eq. 8).</w:t>
+      </w:r>
+    </w:p>
+    <w:p>
+      <w:pPr>
+        <w:pStyle w:val="ListBullet"/>
+      </w:pPr>
+      <w:r>
+        <w:t>Sec. 9.2 lists only REMOVE and PRESERVE for E2, so ADD and REPLACE are as in E1; E3 changes only REPLACE (Sec. 9.3 defines only REPLACE), with ADD, REMOVE and PRESERVE as in E2.</w:t>
+      </w:r>
+    </w:p>
+    <w:p>
+      <w:pPr>
+        <w:pStyle w:val="ListBullet"/>
+      </w:pPr>
+      <w:r>
+        <w:t>The grounded prototype z- is the raw convex combination of local vectors (not L2-normalised), as the protocol writes it; the normalised variant differs by less than 0.1 mAP@5 (25.26 vs 25.18 for E2).</w:t>
+      </w:r>
+    </w:p>
+    <w:p>
+      <w:pPr>
+        <w:pStyle w:val="ListBullet"/>
+      </w:pPr>
+      <w:r>
+        <w:t>Atoms lacking a required field are dropped (0 dropped in this run); queries without a usable compiler output fall back to Target-only scoring on the raw text (0 in this run). Mean atoms per query: 2.55.</w:t>
+      </w:r>
+    </w:p>
+    <w:p>
+      <w:pPr>
+        <w:pStyle w:val="ListBullet"/>
+      </w:pPr>
+      <w:r>
+        <w:t>Scoring code was checked against a naive per-candidate implementation of each formula (max abs difference below 5e-8) and E0 gave the same mAP in repeated runs.</w:t>
+      </w:r>
+    </w:p>
+    <w:p>
+      <w:pPr>
+        <w:pStyle w:val="Heading2"/>
+      </w:pPr>
+      <w:r>
+        <w:t>16.6 Limitations and open questions</w:t>
+      </w:r>
+    </w:p>
+    <w:p>
+      <w:pPr>
+        <w:pStyle w:val="ListBullet"/>
+      </w:pPr>
+      <w:r>
+        <w:rPr>
+          <w:b/>
+        </w:rPr>
+        <w:t>Open questions:</w:t>
+      </w:r>
+      <w:r>
+        <w:t xml:space="preserve"> (1) What are the official TAPR factor weights theta_T, theta_A, theta_P, theta_R for E0? (2) Is the extended compiler prompt and the Qwen3.6-27B model acceptable in place of Sec. 5.2 verbatim / Qwen2.5-VL-7B? (3) Given the grounding diagnostic in 16.4, should the P0 runs continue to CIRR? (4) May a control "E0 without the reference-continuity term" be added to explain the E0/E1 gap (outside the E0-E4 list)?</w:t>
+      </w:r>
+    </w:p>
+    <w:p>
+      <w:pPr>
+        <w:pStyle w:val="ListBullet"/>
+      </w:pPr>
+      <w:r>
+        <w:rPr>
+          <w:b/>
+        </w:rPr>
+        <w:t>Limitations:</w:t>
+      </w:r>
+      <w:r>
+        <w:t xml:space="preserve"> 220 queries on one split, one compiler and one prompt; many subgroup comparisons without multiplicity correction (treat subgroup numbers as indicative); E0 weights are a placeholder; compiler labels are unofficial; CIRR is missing.</w:t>
+      </w:r>
+    </w:p>
+    <w:p>
+      <w:pPr>
+        <w:pStyle w:val="Heading2"/>
+      </w:pPr>
+      <w:r>
+        <w:t>16.7 Reproducibility</w:t>
+      </w:r>
+    </w:p>
+    <w:p>
+      <w:pPr>
+        <w:pStyle w:val="ListBullet"/>
+      </w:pPr>
+      <w:r>
+        <w:t>Code: github.com/khaidz123321/TraceCir, branch main (compiler prompt v4 and Qwen3.x support, E0 in src/p0/run_e0.py, E1-E4 in src/p0/scoring_transition.py and src/p0/run_transition.py, heatmaps in tools/make_grounding_heatmaps.py).</w:t>
+      </w:r>
+    </w:p>
+    <w:p>
+      <w:pPr>
+        <w:pStyle w:val="ListBullet"/>
+      </w:pPr>
+      <w:r>
+        <w:t>Detailed tables and the raw per-query outputs: docs/E0_RESULTS.md; docs/BAO_CAO_COMPILER_AUDIT.docx; docs/BAO_CAO_E0_E1.docx; compiled queries and per-query AP files in the student's audit/server_outputs folder.</w:t>
+      </w:r>
+    </w:p>
+    <w:p>
+      <w:pPr>
+        <w:pStyle w:val="ListBullet"/>
+      </w:pPr>
+      <w:r>
+        <w:t>Example: python -m src.p0.run_transition --variant e4 --dataset circo --split val --data-root &lt;CIRCO&gt; --feature-cache-dir &lt;cache&gt; --compiled-queries-path &lt;compiled.jsonl&gt; [--beta 10 --lambda-edit 0.5 --tau-g 0.02].</w:t>
+      </w:r>
     </w:p>
     <w:sectPr>
       <w:footerReference w:type="default" r:id="rId9"/>

</xml_diff>

<commit_message>
Protocol docx: fill CIRR columns of Table 12.1 (all E0-E4) and add Section 17 (full CIRR results, H1-H3 reading)
Co-Authored-By: Claude Sonnet 5 <noreply@anthropic.com>
</commit_message>
<xml_diff>
--- a/P0_TRACE_CIR_Experimental_QKhai.docx
+++ b/P0_TRACE_CIR_Experimental_QKhai.docx
@@ -2151,7 +2151,7 @@
                 <w:b w:val="0"/>
                 <w:sz w:val="17"/>
               </w:rPr>
-              <w:t>not run</w:t>
+              <w:t>36.00</w:t>
             </w:r>
           </w:p>
         </w:tc>
@@ -2167,7 +2167,7 @@
                 <w:b w:val="0"/>
                 <w:sz w:val="17"/>
               </w:rPr>
-              <w:t>not run</w:t>
+              <w:t>67.54</w:t>
             </w:r>
           </w:p>
         </w:tc>
@@ -2183,7 +2183,7 @@
                 <w:b w:val="0"/>
                 <w:sz w:val="17"/>
               </w:rPr>
-              <w:t>not run</w:t>
+              <w:t>79.12</w:t>
             </w:r>
           </w:p>
         </w:tc>
@@ -2250,7 +2250,7 @@
                 <w:b w:val="0"/>
                 <w:sz w:val="17"/>
               </w:rPr>
-              <w:t>not run</w:t>
+              <w:t>32.17</w:t>
             </w:r>
           </w:p>
         </w:tc>
@@ -2266,7 +2266,7 @@
                 <w:b w:val="0"/>
                 <w:sz w:val="17"/>
               </w:rPr>
-              <w:t>not run</w:t>
+              <w:t>62.57</w:t>
             </w:r>
           </w:p>
         </w:tc>
@@ -2282,7 +2282,7 @@
                 <w:b w:val="0"/>
                 <w:sz w:val="17"/>
               </w:rPr>
-              <w:t>not run</w:t>
+              <w:t>74.12</w:t>
             </w:r>
           </w:p>
         </w:tc>
@@ -2349,7 +2349,7 @@
                 <w:b w:val="0"/>
                 <w:sz w:val="17"/>
               </w:rPr>
-              <w:t>not run</w:t>
+              <w:t>32.46</w:t>
             </w:r>
           </w:p>
         </w:tc>
@@ -2365,7 +2365,7 @@
                 <w:b w:val="0"/>
                 <w:sz w:val="17"/>
               </w:rPr>
-              <w:t>not run</w:t>
+              <w:t>63.24</w:t>
             </w:r>
           </w:p>
         </w:tc>
@@ -2381,7 +2381,7 @@
                 <w:b w:val="0"/>
                 <w:sz w:val="17"/>
               </w:rPr>
-              <w:t>not run</w:t>
+              <w:t>74.60</w:t>
             </w:r>
           </w:p>
         </w:tc>
@@ -2448,7 +2448,7 @@
                 <w:b w:val="0"/>
                 <w:sz w:val="17"/>
               </w:rPr>
-              <w:t>not run</w:t>
+              <w:t>30.02</w:t>
             </w:r>
           </w:p>
         </w:tc>
@@ -2464,7 +2464,7 @@
                 <w:b w:val="0"/>
                 <w:sz w:val="17"/>
               </w:rPr>
-              <w:t>not run</w:t>
+              <w:t>59.70</w:t>
             </w:r>
           </w:p>
         </w:tc>
@@ -2480,7 +2480,7 @@
                 <w:b w:val="0"/>
                 <w:sz w:val="17"/>
               </w:rPr>
-              <w:t>not run</w:t>
+              <w:t>71.63</w:t>
             </w:r>
           </w:p>
         </w:tc>
@@ -2547,7 +2547,7 @@
                 <w:b w:val="0"/>
                 <w:sz w:val="17"/>
               </w:rPr>
-              <w:t>not run</w:t>
+              <w:t>31.79</w:t>
             </w:r>
           </w:p>
         </w:tc>
@@ -2563,7 +2563,7 @@
                 <w:b w:val="0"/>
                 <w:sz w:val="17"/>
               </w:rPr>
-              <w:t>not run</w:t>
+              <w:t>62.74</w:t>
             </w:r>
           </w:p>
         </w:tc>
@@ -2579,7 +2579,7 @@
                 <w:b w:val="0"/>
                 <w:sz w:val="17"/>
               </w:rPr>
-              <w:t>not run</w:t>
+              <w:t>74.46</w:t>
             </w:r>
           </w:p>
         </w:tc>
@@ -5818,6 +5818,1353 @@
       </w:pPr>
       <w:r>
         <w:t>Example: python -m src.p0.run_transition --variant e4 --dataset circo --split val --data-root &lt;CIRCO&gt; --feature-cache-dir &lt;cache&gt; --compiled-queries-path &lt;compiled.jsonl&gt; [--beta 10 --lambda-edit 0.5 --tau-g 0.02].</w:t>
+      </w:r>
+    </w:p>
+    <w:p>
+      <w:pPr>
+        <w:pStyle w:val="Heading1"/>
+      </w:pPr>
+      <w:r>
+        <w:t>17. CIRR Results (2026-09-23 update)</w:t>
+      </w:r>
+    </w:p>
+    <w:p>
+      <w:r>
+        <w:rPr>
+          <w:b w:val="0"/>
+          <w:i/>
+          <w:color w:val="A61E1E"/>
+        </w:rPr>
+        <w:t>Status update: CIRR validation (4181 queries) is now fully compiled (1 parse failure) and E0-E4 have all been run. Table 12.1 above is now filled for CIRR (R@1/R@5/R@10). Section 16 above still reflects the 2026-09-20 CIRCO-only status; this section adds the CIRR results without altering it.</w:t>
+      </w:r>
+    </w:p>
+    <w:p>
+      <w:pPr>
+        <w:pStyle w:val="Heading2"/>
+      </w:pPr>
+      <w:r>
+        <w:t>17.1 CIRR retrieval results</w:t>
+      </w:r>
+    </w:p>
+    <w:tbl>
+      <w:tblPr>
+        <w:tblStyle w:val="TableGrid"/>
+        <w:tblW w:type="auto" w:w="0"/>
+        <w:jc w:val="center"/>
+        <w:tblLayout w:type="fixed"/>
+        <w:tblLook w:firstColumn="1" w:firstRow="1" w:lastColumn="0" w:lastRow="0" w:noHBand="0" w:noVBand="1" w:val="04A0"/>
+      </w:tblPr>
+      <w:tblGrid>
+        <w:gridCol w:w="1260"/>
+        <w:gridCol w:w="1260"/>
+        <w:gridCol w:w="1260"/>
+        <w:gridCol w:w="1260"/>
+        <w:gridCol w:w="1260"/>
+        <w:gridCol w:w="1260"/>
+        <w:gridCol w:w="1260"/>
+        <w:gridCol w:w="1260"/>
+      </w:tblGrid>
+      <w:tr>
+        <w:tc>
+          <w:tcPr>
+            <w:tcW w:type="dxa" w:w="2494"/>
+            <w:shd w:val="clear" w:color="auto" w:fill="D9E2F3"/>
+          </w:tcPr>
+          <w:p>
+            <w:r/>
+            <w:r>
+              <w:rPr>
+                <w:b/>
+                <w:sz w:val="17"/>
+              </w:rPr>
+              <w:t>Method (CIRR val, %)</w:t>
+            </w:r>
+          </w:p>
+        </w:tc>
+        <w:tc>
+          <w:tcPr>
+            <w:tcW w:type="dxa" w:w="907"/>
+            <w:shd w:val="clear" w:color="auto" w:fill="D9E2F3"/>
+          </w:tcPr>
+          <w:p>
+            <w:r/>
+            <w:r>
+              <w:rPr>
+                <w:b/>
+                <w:sz w:val="17"/>
+              </w:rPr>
+              <w:t>R@1</w:t>
+            </w:r>
+          </w:p>
+        </w:tc>
+        <w:tc>
+          <w:tcPr>
+            <w:tcW w:type="dxa" w:w="907"/>
+            <w:shd w:val="clear" w:color="auto" w:fill="D9E2F3"/>
+          </w:tcPr>
+          <w:p>
+            <w:r/>
+            <w:r>
+              <w:rPr>
+                <w:b/>
+                <w:sz w:val="17"/>
+              </w:rPr>
+              <w:t>R@5</w:t>
+            </w:r>
+          </w:p>
+        </w:tc>
+        <w:tc>
+          <w:tcPr>
+            <w:tcW w:type="dxa" w:w="964"/>
+            <w:shd w:val="clear" w:color="auto" w:fill="D9E2F3"/>
+          </w:tcPr>
+          <w:p>
+            <w:r/>
+            <w:r>
+              <w:rPr>
+                <w:b/>
+                <w:sz w:val="17"/>
+              </w:rPr>
+              <w:t>R@10</w:t>
+            </w:r>
+          </w:p>
+        </w:tc>
+        <w:tc>
+          <w:tcPr>
+            <w:tcW w:type="dxa" w:w="964"/>
+            <w:shd w:val="clear" w:color="auto" w:fill="D9E2F3"/>
+          </w:tcPr>
+          <w:p>
+            <w:r/>
+            <w:r>
+              <w:rPr>
+                <w:b/>
+                <w:sz w:val="17"/>
+              </w:rPr>
+              <w:t>R@50</w:t>
+            </w:r>
+          </w:p>
+        </w:tc>
+        <w:tc>
+          <w:tcPr>
+            <w:tcW w:type="dxa" w:w="1077"/>
+            <w:shd w:val="clear" w:color="auto" w:fill="D9E2F3"/>
+          </w:tcPr>
+          <w:p>
+            <w:r/>
+            <w:r>
+              <w:rPr>
+                <w:b/>
+                <w:sz w:val="17"/>
+              </w:rPr>
+              <w:t>R_sub@1</w:t>
+            </w:r>
+          </w:p>
+        </w:tc>
+        <w:tc>
+          <w:tcPr>
+            <w:tcW w:type="dxa" w:w="1077"/>
+            <w:shd w:val="clear" w:color="auto" w:fill="D9E2F3"/>
+          </w:tcPr>
+          <w:p>
+            <w:r/>
+            <w:r>
+              <w:rPr>
+                <w:b/>
+                <w:sz w:val="17"/>
+              </w:rPr>
+              <w:t>R_sub@2</w:t>
+            </w:r>
+          </w:p>
+        </w:tc>
+        <w:tc>
+          <w:tcPr>
+            <w:tcW w:type="dxa" w:w="1077"/>
+            <w:shd w:val="clear" w:color="auto" w:fill="D9E2F3"/>
+          </w:tcPr>
+          <w:p>
+            <w:r/>
+            <w:r>
+              <w:rPr>
+                <w:b/>
+                <w:sz w:val="17"/>
+              </w:rPr>
+              <w:t>R_sub@3</w:t>
+            </w:r>
+          </w:p>
+        </w:tc>
+      </w:tr>
+      <w:tr>
+        <w:tc>
+          <w:tcPr>
+            <w:tcW w:type="dxa" w:w="2494"/>
+          </w:tcPr>
+          <w:p>
+            <w:r/>
+            <w:r>
+              <w:rPr>
+                <w:b w:val="0"/>
+                <w:sz w:val="17"/>
+              </w:rPr>
+              <w:t>E0 TAPR-style</w:t>
+            </w:r>
+          </w:p>
+        </w:tc>
+        <w:tc>
+          <w:tcPr>
+            <w:tcW w:type="dxa" w:w="907"/>
+          </w:tcPr>
+          <w:p>
+            <w:r/>
+            <w:r>
+              <w:rPr>
+                <w:b w:val="0"/>
+                <w:sz w:val="17"/>
+              </w:rPr>
+              <w:t>36.00</w:t>
+            </w:r>
+          </w:p>
+        </w:tc>
+        <w:tc>
+          <w:tcPr>
+            <w:tcW w:type="dxa" w:w="907"/>
+          </w:tcPr>
+          <w:p>
+            <w:r/>
+            <w:r>
+              <w:rPr>
+                <w:b w:val="0"/>
+                <w:sz w:val="17"/>
+              </w:rPr>
+              <w:t>67.54</w:t>
+            </w:r>
+          </w:p>
+        </w:tc>
+        <w:tc>
+          <w:tcPr>
+            <w:tcW w:type="dxa" w:w="964"/>
+          </w:tcPr>
+          <w:p>
+            <w:r/>
+            <w:r>
+              <w:rPr>
+                <w:b w:val="0"/>
+                <w:sz w:val="17"/>
+              </w:rPr>
+              <w:t>79.12</w:t>
+            </w:r>
+          </w:p>
+        </w:tc>
+        <w:tc>
+          <w:tcPr>
+            <w:tcW w:type="dxa" w:w="964"/>
+          </w:tcPr>
+          <w:p>
+            <w:r/>
+            <w:r>
+              <w:rPr>
+                <w:b w:val="0"/>
+                <w:sz w:val="17"/>
+              </w:rPr>
+              <w:t>93.92</w:t>
+            </w:r>
+          </w:p>
+        </w:tc>
+        <w:tc>
+          <w:tcPr>
+            <w:tcW w:type="dxa" w:w="1077"/>
+          </w:tcPr>
+          <w:p>
+            <w:r/>
+            <w:r>
+              <w:rPr>
+                <w:b w:val="0"/>
+                <w:sz w:val="17"/>
+              </w:rPr>
+              <w:t>65.46</w:t>
+            </w:r>
+          </w:p>
+        </w:tc>
+        <w:tc>
+          <w:tcPr>
+            <w:tcW w:type="dxa" w:w="1077"/>
+          </w:tcPr>
+          <w:p>
+            <w:r/>
+            <w:r>
+              <w:rPr>
+                <w:b w:val="0"/>
+                <w:sz w:val="17"/>
+              </w:rPr>
+              <w:t>83.88</w:t>
+            </w:r>
+          </w:p>
+        </w:tc>
+        <w:tc>
+          <w:tcPr>
+            <w:tcW w:type="dxa" w:w="1077"/>
+          </w:tcPr>
+          <w:p>
+            <w:r/>
+            <w:r>
+              <w:rPr>
+                <w:b w:val="0"/>
+                <w:sz w:val="17"/>
+              </w:rPr>
+              <w:t>92.39</w:t>
+            </w:r>
+          </w:p>
+        </w:tc>
+      </w:tr>
+      <w:tr>
+        <w:tc>
+          <w:tcPr>
+            <w:tcW w:type="dxa" w:w="2494"/>
+          </w:tcPr>
+          <w:p>
+            <w:r/>
+            <w:r>
+              <w:rPr>
+                <w:b w:val="0"/>
+                <w:sz w:val="17"/>
+              </w:rPr>
+              <w:t>E1 Transition atoms</w:t>
+            </w:r>
+          </w:p>
+        </w:tc>
+        <w:tc>
+          <w:tcPr>
+            <w:tcW w:type="dxa" w:w="907"/>
+          </w:tcPr>
+          <w:p>
+            <w:r/>
+            <w:r>
+              <w:rPr>
+                <w:b w:val="0"/>
+                <w:sz w:val="17"/>
+              </w:rPr>
+              <w:t>32.17</w:t>
+            </w:r>
+          </w:p>
+        </w:tc>
+        <w:tc>
+          <w:tcPr>
+            <w:tcW w:type="dxa" w:w="907"/>
+          </w:tcPr>
+          <w:p>
+            <w:r/>
+            <w:r>
+              <w:rPr>
+                <w:b w:val="0"/>
+                <w:sz w:val="17"/>
+              </w:rPr>
+              <w:t>62.57</w:t>
+            </w:r>
+          </w:p>
+        </w:tc>
+        <w:tc>
+          <w:tcPr>
+            <w:tcW w:type="dxa" w:w="964"/>
+          </w:tcPr>
+          <w:p>
+            <w:r/>
+            <w:r>
+              <w:rPr>
+                <w:b w:val="0"/>
+                <w:sz w:val="17"/>
+              </w:rPr>
+              <w:t>74.12</w:t>
+            </w:r>
+          </w:p>
+        </w:tc>
+        <w:tc>
+          <w:tcPr>
+            <w:tcW w:type="dxa" w:w="964"/>
+          </w:tcPr>
+          <w:p>
+            <w:r/>
+            <w:r>
+              <w:rPr>
+                <w:b w:val="0"/>
+                <w:sz w:val="17"/>
+              </w:rPr>
+              <w:t>90.96</w:t>
+            </w:r>
+          </w:p>
+        </w:tc>
+        <w:tc>
+          <w:tcPr>
+            <w:tcW w:type="dxa" w:w="1077"/>
+          </w:tcPr>
+          <w:p>
+            <w:r/>
+            <w:r>
+              <w:rPr>
+                <w:b w:val="0"/>
+                <w:sz w:val="17"/>
+              </w:rPr>
+              <w:t>67.76</w:t>
+            </w:r>
+          </w:p>
+        </w:tc>
+        <w:tc>
+          <w:tcPr>
+            <w:tcW w:type="dxa" w:w="1077"/>
+          </w:tcPr>
+          <w:p>
+            <w:r/>
+            <w:r>
+              <w:rPr>
+                <w:b w:val="0"/>
+                <w:sz w:val="17"/>
+              </w:rPr>
+              <w:t>84.72</w:t>
+            </w:r>
+          </w:p>
+        </w:tc>
+        <w:tc>
+          <w:tcPr>
+            <w:tcW w:type="dxa" w:w="1077"/>
+          </w:tcPr>
+          <w:p>
+            <w:r/>
+            <w:r>
+              <w:rPr>
+                <w:b w:val="0"/>
+                <w:sz w:val="17"/>
+              </w:rPr>
+              <w:t>92.44</w:t>
+            </w:r>
+          </w:p>
+        </w:tc>
+      </w:tr>
+      <w:tr>
+        <w:tc>
+          <w:tcPr>
+            <w:tcW w:type="dxa" w:w="2494"/>
+          </w:tcPr>
+          <w:p>
+            <w:r/>
+            <w:r>
+              <w:rPr>
+                <w:b w:val="0"/>
+                <w:sz w:val="17"/>
+              </w:rPr>
+              <w:t>E2 + Source grounding</w:t>
+            </w:r>
+          </w:p>
+        </w:tc>
+        <w:tc>
+          <w:tcPr>
+            <w:tcW w:type="dxa" w:w="907"/>
+          </w:tcPr>
+          <w:p>
+            <w:r/>
+            <w:r>
+              <w:rPr>
+                <w:b w:val="0"/>
+                <w:sz w:val="17"/>
+              </w:rPr>
+              <w:t>32.46</w:t>
+            </w:r>
+          </w:p>
+        </w:tc>
+        <w:tc>
+          <w:tcPr>
+            <w:tcW w:type="dxa" w:w="907"/>
+          </w:tcPr>
+          <w:p>
+            <w:r/>
+            <w:r>
+              <w:rPr>
+                <w:b w:val="0"/>
+                <w:sz w:val="17"/>
+              </w:rPr>
+              <w:t>63.24</w:t>
+            </w:r>
+          </w:p>
+        </w:tc>
+        <w:tc>
+          <w:tcPr>
+            <w:tcW w:type="dxa" w:w="964"/>
+          </w:tcPr>
+          <w:p>
+            <w:r/>
+            <w:r>
+              <w:rPr>
+                <w:b w:val="0"/>
+                <w:sz w:val="17"/>
+              </w:rPr>
+              <w:t>74.60</w:t>
+            </w:r>
+          </w:p>
+        </w:tc>
+        <w:tc>
+          <w:tcPr>
+            <w:tcW w:type="dxa" w:w="964"/>
+          </w:tcPr>
+          <w:p>
+            <w:r/>
+            <w:r>
+              <w:rPr>
+                <w:b w:val="0"/>
+                <w:sz w:val="17"/>
+              </w:rPr>
+              <w:t>91.46</w:t>
+            </w:r>
+          </w:p>
+        </w:tc>
+        <w:tc>
+          <w:tcPr>
+            <w:tcW w:type="dxa" w:w="1077"/>
+          </w:tcPr>
+          <w:p>
+            <w:r/>
+            <w:r>
+              <w:rPr>
+                <w:b w:val="0"/>
+                <w:sz w:val="17"/>
+              </w:rPr>
+              <w:t>67.76</w:t>
+            </w:r>
+          </w:p>
+        </w:tc>
+        <w:tc>
+          <w:tcPr>
+            <w:tcW w:type="dxa" w:w="1077"/>
+          </w:tcPr>
+          <w:p>
+            <w:r/>
+            <w:r>
+              <w:rPr>
+                <w:b w:val="0"/>
+                <w:sz w:val="17"/>
+              </w:rPr>
+              <w:t>84.62</w:t>
+            </w:r>
+          </w:p>
+        </w:tc>
+        <w:tc>
+          <w:tcPr>
+            <w:tcW w:type="dxa" w:w="1077"/>
+          </w:tcPr>
+          <w:p>
+            <w:r/>
+            <w:r>
+              <w:rPr>
+                <w:b w:val="0"/>
+                <w:sz w:val="17"/>
+              </w:rPr>
+              <w:t>92.47</w:t>
+            </w:r>
+          </w:p>
+        </w:tc>
+      </w:tr>
+      <w:tr>
+        <w:tc>
+          <w:tcPr>
+            <w:tcW w:type="dxa" w:w="2494"/>
+          </w:tcPr>
+          <w:p>
+            <w:r/>
+            <w:r>
+              <w:rPr>
+                <w:b w:val="0"/>
+                <w:sz w:val="17"/>
+              </w:rPr>
+              <w:t>E3 + Local delta</w:t>
+            </w:r>
+          </w:p>
+        </w:tc>
+        <w:tc>
+          <w:tcPr>
+            <w:tcW w:type="dxa" w:w="907"/>
+          </w:tcPr>
+          <w:p>
+            <w:r/>
+            <w:r>
+              <w:rPr>
+                <w:b w:val="0"/>
+                <w:sz w:val="17"/>
+              </w:rPr>
+              <w:t>30.02</w:t>
+            </w:r>
+          </w:p>
+        </w:tc>
+        <w:tc>
+          <w:tcPr>
+            <w:tcW w:type="dxa" w:w="907"/>
+          </w:tcPr>
+          <w:p>
+            <w:r/>
+            <w:r>
+              <w:rPr>
+                <w:b w:val="0"/>
+                <w:sz w:val="17"/>
+              </w:rPr>
+              <w:t>59.70</w:t>
+            </w:r>
+          </w:p>
+        </w:tc>
+        <w:tc>
+          <w:tcPr>
+            <w:tcW w:type="dxa" w:w="964"/>
+          </w:tcPr>
+          <w:p>
+            <w:r/>
+            <w:r>
+              <w:rPr>
+                <w:b w:val="0"/>
+                <w:sz w:val="17"/>
+              </w:rPr>
+              <w:t>71.63</w:t>
+            </w:r>
+          </w:p>
+        </w:tc>
+        <w:tc>
+          <w:tcPr>
+            <w:tcW w:type="dxa" w:w="964"/>
+          </w:tcPr>
+          <w:p>
+            <w:r/>
+            <w:r>
+              <w:rPr>
+                <w:b w:val="0"/>
+                <w:sz w:val="17"/>
+              </w:rPr>
+              <w:t>89.69</w:t>
+            </w:r>
+          </w:p>
+        </w:tc>
+        <w:tc>
+          <w:tcPr>
+            <w:tcW w:type="dxa" w:w="1077"/>
+          </w:tcPr>
+          <w:p>
+            <w:r/>
+            <w:r>
+              <w:rPr>
+                <w:b w:val="0"/>
+                <w:sz w:val="17"/>
+              </w:rPr>
+              <w:t>67.38</w:t>
+            </w:r>
+          </w:p>
+        </w:tc>
+        <w:tc>
+          <w:tcPr>
+            <w:tcW w:type="dxa" w:w="1077"/>
+          </w:tcPr>
+          <w:p>
+            <w:r/>
+            <w:r>
+              <w:rPr>
+                <w:b w:val="0"/>
+                <w:sz w:val="17"/>
+              </w:rPr>
+              <w:t>84.38</w:t>
+            </w:r>
+          </w:p>
+        </w:tc>
+        <w:tc>
+          <w:tcPr>
+            <w:tcW w:type="dxa" w:w="1077"/>
+          </w:tcPr>
+          <w:p>
+            <w:r/>
+            <w:r>
+              <w:rPr>
+                <w:b w:val="0"/>
+                <w:sz w:val="17"/>
+              </w:rPr>
+              <w:t>92.47</w:t>
+            </w:r>
+          </w:p>
+        </w:tc>
+      </w:tr>
+      <w:tr>
+        <w:tc>
+          <w:tcPr>
+            <w:tcW w:type="dxa" w:w="2494"/>
+          </w:tcPr>
+          <w:p>
+            <w:r/>
+            <w:r>
+              <w:rPr>
+                <w:b/>
+                <w:sz w:val="17"/>
+              </w:rPr>
+              <w:t>E4 Full P0</w:t>
+            </w:r>
+          </w:p>
+        </w:tc>
+        <w:tc>
+          <w:tcPr>
+            <w:tcW w:type="dxa" w:w="907"/>
+          </w:tcPr>
+          <w:p>
+            <w:r/>
+            <w:r>
+              <w:rPr>
+                <w:b/>
+                <w:sz w:val="17"/>
+              </w:rPr>
+              <w:t>31.79</w:t>
+            </w:r>
+          </w:p>
+        </w:tc>
+        <w:tc>
+          <w:tcPr>
+            <w:tcW w:type="dxa" w:w="907"/>
+          </w:tcPr>
+          <w:p>
+            <w:r/>
+            <w:r>
+              <w:rPr>
+                <w:b/>
+                <w:sz w:val="17"/>
+              </w:rPr>
+              <w:t>62.74</w:t>
+            </w:r>
+          </w:p>
+        </w:tc>
+        <w:tc>
+          <w:tcPr>
+            <w:tcW w:type="dxa" w:w="964"/>
+          </w:tcPr>
+          <w:p>
+            <w:r/>
+            <w:r>
+              <w:rPr>
+                <w:b/>
+                <w:sz w:val="17"/>
+              </w:rPr>
+              <w:t>74.46</w:t>
+            </w:r>
+          </w:p>
+        </w:tc>
+        <w:tc>
+          <w:tcPr>
+            <w:tcW w:type="dxa" w:w="964"/>
+          </w:tcPr>
+          <w:p>
+            <w:r/>
+            <w:r>
+              <w:rPr>
+                <w:b/>
+                <w:sz w:val="17"/>
+              </w:rPr>
+              <w:t>91.65</w:t>
+            </w:r>
+          </w:p>
+        </w:tc>
+        <w:tc>
+          <w:tcPr>
+            <w:tcW w:type="dxa" w:w="1077"/>
+          </w:tcPr>
+          <w:p>
+            <w:r/>
+            <w:r>
+              <w:rPr>
+                <w:b/>
+                <w:sz w:val="17"/>
+              </w:rPr>
+              <w:t>66.95</w:t>
+            </w:r>
+          </w:p>
+        </w:tc>
+        <w:tc>
+          <w:tcPr>
+            <w:tcW w:type="dxa" w:w="1077"/>
+          </w:tcPr>
+          <w:p>
+            <w:r/>
+            <w:r>
+              <w:rPr>
+                <w:b/>
+                <w:sz w:val="17"/>
+              </w:rPr>
+              <w:t>84.12</w:t>
+            </w:r>
+          </w:p>
+        </w:tc>
+        <w:tc>
+          <w:tcPr>
+            <w:tcW w:type="dxa" w:w="1077"/>
+          </w:tcPr>
+          <w:p>
+            <w:r/>
+            <w:r>
+              <w:rPr>
+                <w:b/>
+                <w:sz w:val="17"/>
+              </w:rPr>
+              <w:t>92.49</w:t>
+            </w:r>
+          </w:p>
+        </w:tc>
+      </w:tr>
+      <w:tr>
+        <w:tc>
+          <w:tcPr>
+            <w:tcW w:type="dxa" w:w="2494"/>
+          </w:tcPr>
+          <w:p>
+            <w:r/>
+            <w:r>
+              <w:rPr>
+                <w:b w:val="0"/>
+                <w:sz w:val="17"/>
+              </w:rPr>
+              <w:t>Reference: TAPR paper, ViT-L, CIRR test</w:t>
+            </w:r>
+          </w:p>
+        </w:tc>
+        <w:tc>
+          <w:tcPr>
+            <w:tcW w:type="dxa" w:w="907"/>
+          </w:tcPr>
+          <w:p>
+            <w:r/>
+            <w:r>
+              <w:rPr>
+                <w:b w:val="0"/>
+                <w:sz w:val="17"/>
+              </w:rPr>
+              <w:t>40.17</w:t>
+            </w:r>
+          </w:p>
+        </w:tc>
+        <w:tc>
+          <w:tcPr>
+            <w:tcW w:type="dxa" w:w="907"/>
+          </w:tcPr>
+          <w:p>
+            <w:r/>
+            <w:r>
+              <w:rPr>
+                <w:b w:val="0"/>
+                <w:sz w:val="17"/>
+              </w:rPr>
+              <w:t>71.23</w:t>
+            </w:r>
+          </w:p>
+        </w:tc>
+        <w:tc>
+          <w:tcPr>
+            <w:tcW w:type="dxa" w:w="964"/>
+          </w:tcPr>
+          <w:p>
+            <w:r/>
+            <w:r>
+              <w:rPr>
+                <w:b w:val="0"/>
+                <w:sz w:val="17"/>
+              </w:rPr>
+              <w:t>81.35</w:t>
+            </w:r>
+          </w:p>
+        </w:tc>
+        <w:tc>
+          <w:tcPr>
+            <w:tcW w:type="dxa" w:w="964"/>
+          </w:tcPr>
+          <w:p>
+            <w:r/>
+            <w:r>
+              <w:rPr>
+                <w:b w:val="0"/>
+                <w:sz w:val="17"/>
+              </w:rPr>
+              <w:t>-</w:t>
+            </w:r>
+          </w:p>
+        </w:tc>
+        <w:tc>
+          <w:tcPr>
+            <w:tcW w:type="dxa" w:w="1077"/>
+          </w:tcPr>
+          <w:p>
+            <w:r/>
+            <w:r>
+              <w:rPr>
+                <w:b w:val="0"/>
+                <w:sz w:val="17"/>
+              </w:rPr>
+              <w:t>-</w:t>
+            </w:r>
+          </w:p>
+        </w:tc>
+        <w:tc>
+          <w:tcPr>
+            <w:tcW w:type="dxa" w:w="1077"/>
+          </w:tcPr>
+          <w:p>
+            <w:r/>
+            <w:r>
+              <w:rPr>
+                <w:b w:val="0"/>
+                <w:sz w:val="17"/>
+              </w:rPr>
+              <w:t>-</w:t>
+            </w:r>
+          </w:p>
+        </w:tc>
+        <w:tc>
+          <w:tcPr>
+            <w:tcW w:type="dxa" w:w="1077"/>
+          </w:tcPr>
+          <w:p>
+            <w:r/>
+            <w:r>
+              <w:rPr>
+                <w:b w:val="0"/>
+                <w:sz w:val="17"/>
+              </w:rPr>
+              <w:t>-</w:t>
+            </w:r>
+          </w:p>
+        </w:tc>
+      </w:tr>
+    </w:tbl>
+    <w:p/>
+    <w:p>
+      <w:pPr>
+        <w:pStyle w:val="Heading2"/>
+      </w:pPr>
+      <w:r>
+        <w:t>17.2 Paired significance (bootstrap, 10,000 resamples, hit@1 per query, n = 4181)</w:t>
+      </w:r>
+    </w:p>
+    <w:tbl>
+      <w:tblPr>
+        <w:tblStyle w:val="TableGrid"/>
+        <w:tblW w:type="auto" w:w="0"/>
+        <w:jc w:val="center"/>
+        <w:tblLayout w:type="fixed"/>
+        <w:tblLook w:firstColumn="1" w:firstRow="1" w:lastColumn="0" w:lastRow="0" w:noHBand="0" w:noVBand="1" w:val="04A0"/>
+      </w:tblPr>
+      <w:tblGrid>
+        <w:gridCol w:w="2520"/>
+        <w:gridCol w:w="2520"/>
+        <w:gridCol w:w="2520"/>
+        <w:gridCol w:w="2520"/>
+      </w:tblGrid>
+      <w:tr>
+        <w:tc>
+          <w:tcPr>
+            <w:tcW w:type="dxa" w:w="2608"/>
+            <w:shd w:val="clear" w:color="auto" w:fill="D9E2F3"/>
+          </w:tcPr>
+          <w:p>
+            <w:r/>
+            <w:r>
+              <w:rPr>
+                <w:b/>
+                <w:sz w:val="17"/>
+              </w:rPr>
+              <w:t>Comparison</w:t>
+            </w:r>
+          </w:p>
+        </w:tc>
+        <w:tc>
+          <w:tcPr>
+            <w:tcW w:type="dxa" w:w="1474"/>
+            <w:shd w:val="clear" w:color="auto" w:fill="D9E2F3"/>
+          </w:tcPr>
+          <w:p>
+            <w:r/>
+            <w:r>
+              <w:rPr>
+                <w:b/>
+                <w:sz w:val="17"/>
+              </w:rPr>
+              <w:t>Diff (points)</w:t>
+            </w:r>
+          </w:p>
+        </w:tc>
+        <w:tc>
+          <w:tcPr>
+            <w:tcW w:type="dxa" w:w="2041"/>
+            <w:shd w:val="clear" w:color="auto" w:fill="D9E2F3"/>
+          </w:tcPr>
+          <w:p>
+            <w:r/>
+            <w:r>
+              <w:rPr>
+                <w:b/>
+                <w:sz w:val="17"/>
+              </w:rPr>
+              <w:t>95% CI</w:t>
+            </w:r>
+          </w:p>
+        </w:tc>
+        <w:tc>
+          <w:tcPr>
+            <w:tcW w:type="dxa" w:w="3118"/>
+            <w:shd w:val="clear" w:color="auto" w:fill="D9E2F3"/>
+          </w:tcPr>
+          <w:p>
+            <w:r/>
+            <w:r>
+              <w:rPr>
+                <w:b/>
+                <w:sz w:val="17"/>
+              </w:rPr>
+              <w:t>Reading</w:t>
+            </w:r>
+          </w:p>
+        </w:tc>
+      </w:tr>
+      <w:tr>
+        <w:tc>
+          <w:tcPr>
+            <w:tcW w:type="dxa" w:w="2608"/>
+          </w:tcPr>
+          <w:p>
+            <w:r/>
+            <w:r>
+              <w:rPr>
+                <w:b w:val="0"/>
+                <w:sz w:val="17"/>
+              </w:rPr>
+              <w:t>E1 - E0 (H1)</w:t>
+            </w:r>
+          </w:p>
+        </w:tc>
+        <w:tc>
+          <w:tcPr>
+            <w:tcW w:type="dxa" w:w="1474"/>
+          </w:tcPr>
+          <w:p>
+            <w:r/>
+            <w:r>
+              <w:rPr>
+                <w:b w:val="0"/>
+                <w:sz w:val="17"/>
+              </w:rPr>
+              <w:t>-3.83</w:t>
+            </w:r>
+          </w:p>
+        </w:tc>
+        <w:tc>
+          <w:tcPr>
+            <w:tcW w:type="dxa" w:w="2041"/>
+          </w:tcPr>
+          <w:p>
+            <w:r/>
+            <w:r>
+              <w:rPr>
+                <w:b w:val="0"/>
+                <w:sz w:val="17"/>
+              </w:rPr>
+              <w:t>[-4.97, -2.99]</w:t>
+            </w:r>
+          </w:p>
+        </w:tc>
+        <w:tc>
+          <w:tcPr>
+            <w:tcW w:type="dxa" w:w="3118"/>
+          </w:tcPr>
+          <w:p>
+            <w:r/>
+            <w:r>
+              <w:rPr>
+                <w:b w:val="0"/>
+                <w:sz w:val="17"/>
+              </w:rPr>
+              <w:t>Significant, E1 worse</w:t>
+            </w:r>
+          </w:p>
+        </w:tc>
+      </w:tr>
+      <w:tr>
+        <w:tc>
+          <w:tcPr>
+            <w:tcW w:type="dxa" w:w="2608"/>
+          </w:tcPr>
+          <w:p>
+            <w:r/>
+            <w:r>
+              <w:rPr>
+                <w:b w:val="0"/>
+                <w:sz w:val="17"/>
+              </w:rPr>
+              <w:t>E3 - E0 (+H1+H2)</w:t>
+            </w:r>
+          </w:p>
+        </w:tc>
+        <w:tc>
+          <w:tcPr>
+            <w:tcW w:type="dxa" w:w="1474"/>
+          </w:tcPr>
+          <w:p>
+            <w:r/>
+            <w:r>
+              <w:rPr>
+                <w:b w:val="0"/>
+                <w:sz w:val="17"/>
+              </w:rPr>
+              <w:t>-5.98</w:t>
+            </w:r>
+          </w:p>
+        </w:tc>
+        <w:tc>
+          <w:tcPr>
+            <w:tcW w:type="dxa" w:w="2041"/>
+          </w:tcPr>
+          <w:p>
+            <w:r/>
+            <w:r>
+              <w:rPr>
+                <w:b w:val="0"/>
+                <w:sz w:val="17"/>
+              </w:rPr>
+              <w:t>[-7.25, -4.74]</w:t>
+            </w:r>
+          </w:p>
+        </w:tc>
+        <w:tc>
+          <w:tcPr>
+            <w:tcW w:type="dxa" w:w="3118"/>
+          </w:tcPr>
+          <w:p>
+            <w:r/>
+            <w:r>
+              <w:rPr>
+                <w:b w:val="0"/>
+                <w:sz w:val="17"/>
+              </w:rPr>
+              <w:t>Significant, E3 worse</w:t>
+            </w:r>
+          </w:p>
+        </w:tc>
+      </w:tr>
+      <w:tr>
+        <w:tc>
+          <w:tcPr>
+            <w:tcW w:type="dxa" w:w="2608"/>
+          </w:tcPr>
+          <w:p>
+            <w:r/>
+            <w:r>
+              <w:rPr>
+                <w:b w:val="0"/>
+                <w:sz w:val="17"/>
+              </w:rPr>
+              <w:t>E4 - E0 (full P0)</w:t>
+            </w:r>
+          </w:p>
+        </w:tc>
+        <w:tc>
+          <w:tcPr>
+            <w:tcW w:type="dxa" w:w="1474"/>
+          </w:tcPr>
+          <w:p>
+            <w:r/>
+            <w:r>
+              <w:rPr>
+                <w:b w:val="0"/>
+                <w:sz w:val="17"/>
+              </w:rPr>
+              <w:t>-4.21</w:t>
+            </w:r>
+          </w:p>
+        </w:tc>
+        <w:tc>
+          <w:tcPr>
+            <w:tcW w:type="dxa" w:w="2041"/>
+          </w:tcPr>
+          <w:p>
+            <w:r/>
+            <w:r>
+              <w:rPr>
+                <w:b w:val="0"/>
+                <w:sz w:val="17"/>
+              </w:rPr>
+              <w:t>[-5.43, -2.99]</w:t>
+            </w:r>
+          </w:p>
+        </w:tc>
+        <w:tc>
+          <w:tcPr>
+            <w:tcW w:type="dxa" w:w="3118"/>
+          </w:tcPr>
+          <w:p>
+            <w:r/>
+            <w:r>
+              <w:rPr>
+                <w:b w:val="0"/>
+                <w:sz w:val="17"/>
+              </w:rPr>
+              <w:t>Significant, E4 worse</w:t>
+            </w:r>
+          </w:p>
+        </w:tc>
+      </w:tr>
+      <w:tr>
+        <w:tc>
+          <w:tcPr>
+            <w:tcW w:type="dxa" w:w="2608"/>
+          </w:tcPr>
+          <w:p>
+            <w:r/>
+            <w:r>
+              <w:rPr>
+                <w:b w:val="0"/>
+                <w:sz w:val="17"/>
+              </w:rPr>
+              <w:t>E4 - E3 (H3)</w:t>
+            </w:r>
+          </w:p>
+        </w:tc>
+        <w:tc>
+          <w:tcPr>
+            <w:tcW w:type="dxa" w:w="1474"/>
+          </w:tcPr>
+          <w:p>
+            <w:r/>
+            <w:r>
+              <w:rPr>
+                <w:b w:val="0"/>
+                <w:sz w:val="17"/>
+              </w:rPr>
+              <w:t>+1.77</w:t>
+            </w:r>
+          </w:p>
+        </w:tc>
+        <w:tc>
+          <w:tcPr>
+            <w:tcW w:type="dxa" w:w="2041"/>
+          </w:tcPr>
+          <w:p>
+            <w:r/>
+            <w:r>
+              <w:rPr>
+                <w:b w:val="0"/>
+                <w:sz w:val="17"/>
+              </w:rPr>
+              <w:t>[+1.17, +2.37]</w:t>
+            </w:r>
+          </w:p>
+        </w:tc>
+        <w:tc>
+          <w:tcPr>
+            <w:tcW w:type="dxa" w:w="3118"/>
+          </w:tcPr>
+          <w:p>
+            <w:r/>
+            <w:r>
+              <w:rPr>
+                <w:b w:val="0"/>
+                <w:sz w:val="17"/>
+              </w:rPr>
+              <w:t>Significant, E4 better than E3</w:t>
+            </w:r>
+          </w:p>
+        </w:tc>
+      </w:tr>
+    </w:tbl>
+    <w:p/>
+    <w:p>
+      <w:r>
+        <w:rPr>
+          <w:b/>
+          <w:i w:val="0"/>
+        </w:rPr>
+        <w:t>Reading against H1/H2/H3, combined with the CIRCO results in Section 16:</w:t>
+      </w:r>
+    </w:p>
+    <w:p>
+      <w:pPr>
+        <w:pStyle w:val="ListBullet"/>
+      </w:pPr>
+      <w:r>
+        <w:rPr>
+          <w:b/>
+        </w:rPr>
+        <w:t>H1:</w:t>
+      </w:r>
+      <w:r>
+        <w:t xml:space="preserve"> not supported on CIRR (E1 significantly below E0, unlike the inconclusive CIRCO result at n = 220). CIRR has ~19x more queries, so this is the more decisive of the two readings.</w:t>
+      </w:r>
+    </w:p>
+    <w:p>
+      <w:pPr>
+        <w:pStyle w:val="ListBullet"/>
+      </w:pPr>
+      <w:r>
+        <w:rPr>
+          <w:b/>
+        </w:rPr>
+        <w:t>H2:</w:t>
+      </w:r>
+      <w:r>
+        <w:t xml:space="preserve"> not supported on CIRR either (E2 and E3 do not close the gap to E0; E3 is significantly worse than E0). E2 (source grounding alone) is close to E1 on CIRR (R@1 32.46 vs 32.17), a smaller effect than on CIRCO.</w:t>
+      </w:r>
+    </w:p>
+    <w:p>
+      <w:pPr>
+        <w:pStyle w:val="ListBullet"/>
+      </w:pPr>
+      <w:r>
+        <w:rPr>
+          <w:b/>
+        </w:rPr>
+        <w:t>H3:</w:t>
+      </w:r>
+      <w:r>
+        <w:t xml:space="preserve"> supported on BOTH datasets with statistical significance (CIRCO +2.02 mAP@5 [+0.79,+3.46]; CIRR +1.77 R@1 [+1.17,+2.37]). This is the most reliable finding of the whole P0 study.</w:t>
+      </w:r>
+    </w:p>
+    <w:p>
+      <w:pPr>
+        <w:pStyle w:val="ListBullet"/>
+      </w:pPr>
+      <w:r>
+        <w:rPr>
+          <w:b/>
+        </w:rPr>
+        <w:t>Overall:</w:t>
+      </w:r>
+      <w:r>
+        <w:t xml:space="preserve"> the full system (E4) does not yet match the TAPR baseline (E0) on either dataset, and on CIRR this gap is statistically significant. The coupled-REPLACE idea (H3) has real, reproducible signal; the transition-atom and grounding ideas (H1, H2) as implemented in E1-E3 do not yet help and measurably hurt on CIRR.</w:t>
+      </w:r>
+    </w:p>
+    <w:p>
+      <w:pPr>
+        <w:pStyle w:val="Heading2"/>
+      </w:pPr>
+      <w:r>
+        <w:t>17.3 Failure-case and compiler-example artifacts</w:t>
+      </w:r>
+    </w:p>
+    <w:p>
+      <w:pPr>
+        <w:pStyle w:val="ListBullet"/>
+      </w:pPr>
+      <w:r>
+        <w:rPr>
+          <w:b/>
+        </w:rPr>
+        <w:t>Selected:</w:t>
+      </w:r>
+      <w:r>
+        <w:t xml:space="preserve"> 30 CIRR queries (15 where E0 ranked the target #1 but E4 did not; 15 where both missed #1), with compiled atoms and per-variant target rank, in docs/BAO_CAO_QKHAI_3_NOI_DUNG.docx and audit/cirr/results/failure_cases.json.</w:t>
+      </w:r>
+    </w:p>
+    <w:p>
+      <w:pPr>
+        <w:pStyle w:val="ListBullet"/>
+      </w:pPr>
+      <w:r>
+        <w:rPr>
+          <w:b/>
+        </w:rPr>
+        <w:t>Selected:</w:t>
+      </w:r>
+      <w:r>
+        <w:t xml:space="preserve"> 12 compiler transition-extraction examples (6 Correct, 6 Partially/Incorrect) from the audited CIRR sample, also in docs/BAO_CAO_QKHAI_3_NOI_DUNG.docx.</w:t>
       </w:r>
     </w:p>
     <w:sectPr>

</xml_diff>